<commit_message>
Mejoras en el Panel Administrativo: Gestion de guias con contraseña, edicion de hoteles/guias, y analíticas con datos reales
</commit_message>
<xml_diff>
--- a/DOCUMENTOS/InformeGrupal.docx
+++ b/DOCUMENTOS/InformeGrupal.docx
@@ -316,21 +316,7 @@
               <w:rPr>
                 <w:rFonts w:ascii="Times New Roman" w:eastAsia="Times New Roman" w:hAnsi="Times New Roman" w:cs="Times New Roman"/>
               </w:rPr>
-              <w:t xml:space="preserve">El sistema debe calcular el precio final de una reserva aplicando reglas predefinidas en el </w:t>
-            </w:r>
-            <w:proofErr w:type="spellStart"/>
-            <w:r>
-              <w:rPr>
-                <w:rFonts w:ascii="Times New Roman" w:eastAsia="Times New Roman" w:hAnsi="Times New Roman" w:cs="Times New Roman"/>
-              </w:rPr>
-              <w:t>backend</w:t>
-            </w:r>
-            <w:proofErr w:type="spellEnd"/>
-            <w:r>
-              <w:rPr>
-                <w:rFonts w:ascii="Times New Roman" w:eastAsia="Times New Roman" w:hAnsi="Times New Roman" w:cs="Times New Roman"/>
-              </w:rPr>
-              <w:t xml:space="preserve"> (temporada, horas restantes, demanda actual) sobre el precio base, sin intervención manual.</w:t>
+              <w:t>El sistema debe calcular el precio final de una reserva aplicando reglas predefinidas en el backend (temporada, horas restantes, demanda actual) sobre el precio base, sin intervención manual.</w:t>
             </w:r>
           </w:p>
           <w:p>
@@ -385,7 +371,6 @@
               </w:rPr>
             </w:pPr>
             <w:bookmarkStart w:id="0" w:name="_Int_wXeXM3qe"/>
-            <w:proofErr w:type="spellStart"/>
             <w:r>
               <w:rPr>
                 <w:rFonts w:ascii="Times New Roman" w:eastAsia="Times New Roman" w:hAnsi="Times New Roman" w:cs="Times New Roman"/>
@@ -393,7 +378,6 @@
               <w:t>Matchamaking</w:t>
             </w:r>
             <w:bookmarkEnd w:id="0"/>
-            <w:proofErr w:type="spellEnd"/>
             <w:r>
               <w:rPr>
                 <w:rFonts w:ascii="Times New Roman" w:eastAsia="Times New Roman" w:hAnsi="Times New Roman" w:cs="Times New Roman"/>
@@ -841,7 +825,6 @@
               <w:t xml:space="preserve">Integración de rutas </w:t>
             </w:r>
             <w:bookmarkStart w:id="4" w:name="_Int_zrpUagrU"/>
-            <w:proofErr w:type="spellStart"/>
             <w:r>
               <w:rPr>
                 <w:rFonts w:ascii="Times New Roman" w:eastAsia="Times New Roman" w:hAnsi="Times New Roman" w:cs="Times New Roman"/>
@@ -849,7 +832,6 @@
               <w:t>multi-destino</w:t>
             </w:r>
             <w:bookmarkEnd w:id="4"/>
-            <w:proofErr w:type="spellEnd"/>
           </w:p>
         </w:tc>
         <w:tc>
@@ -1239,24 +1221,9 @@
               <w:rPr>
                 <w:rFonts w:ascii="Times New Roman" w:eastAsia="Times New Roman" w:hAnsi="Times New Roman" w:cs="Times New Roman"/>
               </w:rPr>
-              <w:t xml:space="preserve">La arquitectura del </w:t>
-            </w:r>
-            <w:proofErr w:type="spellStart"/>
-            <w:r>
-              <w:rPr>
-                <w:rFonts w:ascii="Times New Roman" w:eastAsia="Times New Roman" w:hAnsi="Times New Roman" w:cs="Times New Roman"/>
-              </w:rPr>
-              <w:t>backend</w:t>
-            </w:r>
-            <w:proofErr w:type="spellEnd"/>
-            <w:r>
-              <w:rPr>
-                <w:rFonts w:ascii="Times New Roman" w:eastAsia="Times New Roman" w:hAnsi="Times New Roman" w:cs="Times New Roman"/>
-              </w:rPr>
-              <w:t xml:space="preserve"> debe ser </w:t>
+              <w:t xml:space="preserve">La arquitectura del backend debe ser </w:t>
             </w:r>
             <w:bookmarkStart w:id="5" w:name="_Int_u6j67xtC"/>
-            <w:proofErr w:type="spellStart"/>
             <w:r>
               <w:rPr>
                 <w:rFonts w:ascii="Times New Roman" w:eastAsia="Times New Roman" w:hAnsi="Times New Roman" w:cs="Times New Roman"/>
@@ -1264,7 +1231,6 @@
               <w:t>Stateless</w:t>
             </w:r>
             <w:bookmarkEnd w:id="5"/>
-            <w:proofErr w:type="spellEnd"/>
             <w:r>
               <w:rPr>
                 <w:rFonts w:ascii="Times New Roman" w:eastAsia="Times New Roman" w:hAnsi="Times New Roman" w:cs="Times New Roman"/>
@@ -1366,7 +1332,6 @@
               <w:t xml:space="preserve">El servidor de </w:t>
             </w:r>
             <w:bookmarkStart w:id="6" w:name="_Int_BXhEcqtG"/>
-            <w:proofErr w:type="spellStart"/>
             <w:r>
               <w:rPr>
                 <w:rFonts w:ascii="Times New Roman" w:eastAsia="Times New Roman" w:hAnsi="Times New Roman" w:cs="Times New Roman"/>
@@ -1374,7 +1339,6 @@
               <w:t>WebSockets</w:t>
             </w:r>
             <w:bookmarkEnd w:id="6"/>
-            <w:proofErr w:type="spellEnd"/>
             <w:r>
               <w:rPr>
                 <w:rFonts w:ascii="Times New Roman" w:eastAsia="Times New Roman" w:hAnsi="Times New Roman" w:cs="Times New Roman"/>
@@ -1382,7 +1346,6 @@
               <w:t xml:space="preserve"> debe soportar un mínimo de 100 conexiones concurrentes activas para el chat y </w:t>
             </w:r>
             <w:bookmarkStart w:id="7" w:name="_Int_6nom1j0J"/>
-            <w:proofErr w:type="spellStart"/>
             <w:r>
               <w:rPr>
                 <w:rFonts w:ascii="Times New Roman" w:eastAsia="Times New Roman" w:hAnsi="Times New Roman" w:cs="Times New Roman"/>
@@ -1390,7 +1353,6 @@
               <w:t>matchmaking</w:t>
             </w:r>
             <w:bookmarkEnd w:id="7"/>
-            <w:proofErr w:type="spellEnd"/>
             <w:r>
               <w:rPr>
                 <w:rFonts w:ascii="Times New Roman" w:eastAsia="Times New Roman" w:hAnsi="Times New Roman" w:cs="Times New Roman"/>
@@ -1472,7 +1434,6 @@
               <w:t xml:space="preserve">Seguridad de datos / PCI </w:t>
             </w:r>
             <w:bookmarkStart w:id="8" w:name="_Int_9cVDlcVc"/>
-            <w:proofErr w:type="spellStart"/>
             <w:r>
               <w:rPr>
                 <w:rFonts w:ascii="Times New Roman" w:eastAsia="Times New Roman" w:hAnsi="Times New Roman" w:cs="Times New Roman"/>
@@ -1498,7 +1459,6 @@
               <w:t>ance</w:t>
             </w:r>
             <w:bookmarkEnd w:id="8"/>
-            <w:proofErr w:type="spellEnd"/>
           </w:p>
         </w:tc>
         <w:tc>
@@ -1520,7 +1480,6 @@
               <w:t xml:space="preserve">El sistema no debe almacenar datos sensibles de tarjetas de crédito/débito. Toda transacción de pago debe realizarse mediante </w:t>
             </w:r>
             <w:bookmarkStart w:id="9" w:name="_Int_lKplYTJ5"/>
-            <w:proofErr w:type="spellStart"/>
             <w:r>
               <w:rPr>
                 <w:rFonts w:ascii="Times New Roman" w:eastAsia="Times New Roman" w:hAnsi="Times New Roman" w:cs="Times New Roman"/>
@@ -1528,7 +1487,6 @@
               <w:t>tokenización</w:t>
             </w:r>
             <w:bookmarkEnd w:id="9"/>
-            <w:proofErr w:type="spellEnd"/>
             <w:r>
               <w:rPr>
                 <w:rFonts w:ascii="Times New Roman" w:eastAsia="Times New Roman" w:hAnsi="Times New Roman" w:cs="Times New Roman"/>
@@ -1630,7 +1588,6 @@
               <w:t xml:space="preserve">El tamaño del </w:t>
             </w:r>
             <w:bookmarkStart w:id="10" w:name="_Int_dZgauDxK"/>
-            <w:proofErr w:type="spellStart"/>
             <w:r>
               <w:rPr>
                 <w:rFonts w:ascii="Times New Roman" w:eastAsia="Times New Roman" w:hAnsi="Times New Roman" w:cs="Times New Roman"/>
@@ -1638,7 +1595,6 @@
               <w:t>bundle</w:t>
             </w:r>
             <w:bookmarkEnd w:id="10"/>
-            <w:proofErr w:type="spellEnd"/>
             <w:r>
               <w:rPr>
                 <w:rFonts w:ascii="Times New Roman" w:eastAsia="Times New Roman" w:hAnsi="Times New Roman" w:cs="Times New Roman"/>
@@ -1646,7 +1602,6 @@
               <w:t xml:space="preserve"> inicial de la aplicación y los </w:t>
             </w:r>
             <w:bookmarkStart w:id="11" w:name="_Int_BaQ9czoP"/>
-            <w:proofErr w:type="spellStart"/>
             <w:r>
               <w:rPr>
                 <w:rFonts w:ascii="Times New Roman" w:eastAsia="Times New Roman" w:hAnsi="Times New Roman" w:cs="Times New Roman"/>
@@ -1654,7 +1609,6 @@
               <w:t>payloads</w:t>
             </w:r>
             <w:bookmarkEnd w:id="11"/>
-            <w:proofErr w:type="spellEnd"/>
             <w:r>
               <w:rPr>
                 <w:rFonts w:ascii="Times New Roman" w:eastAsia="Times New Roman" w:hAnsi="Times New Roman" w:cs="Times New Roman"/>
@@ -1662,7 +1616,6 @@
               <w:t xml:space="preserve"> JSON de sincronización no deben exceder los 150 KB comprimidos (</w:t>
             </w:r>
             <w:bookmarkStart w:id="12" w:name="_Int_bM7yuX6K"/>
-            <w:proofErr w:type="spellStart"/>
             <w:r>
               <w:rPr>
                 <w:rFonts w:ascii="Times New Roman" w:eastAsia="Times New Roman" w:hAnsi="Times New Roman" w:cs="Times New Roman"/>
@@ -1670,7 +1623,6 @@
               <w:t>Gzip</w:t>
             </w:r>
             <w:bookmarkEnd w:id="12"/>
-            <w:proofErr w:type="spellEnd"/>
             <w:r>
               <w:rPr>
                 <w:rFonts w:ascii="Times New Roman" w:eastAsia="Times New Roman" w:hAnsi="Times New Roman" w:cs="Times New Roman"/>
@@ -1778,7 +1730,6 @@
               <w:t xml:space="preserve">El sistema debe implementar mecanismos de </w:t>
             </w:r>
             <w:bookmarkStart w:id="13" w:name="_Int_g7yZfFfh"/>
-            <w:proofErr w:type="spellStart"/>
             <w:r>
               <w:rPr>
                 <w:rFonts w:ascii="Times New Roman" w:eastAsia="Times New Roman" w:hAnsi="Times New Roman" w:cs="Times New Roman"/>
@@ -1786,26 +1737,11 @@
               <w:t>Graceful</w:t>
             </w:r>
             <w:bookmarkEnd w:id="13"/>
-            <w:proofErr w:type="spellEnd"/>
-            <w:r>
-              <w:rPr>
-                <w:rFonts w:ascii="Times New Roman" w:eastAsia="Times New Roman" w:hAnsi="Times New Roman" w:cs="Times New Roman"/>
-              </w:rPr>
-              <w:t xml:space="preserve"> </w:t>
-            </w:r>
-            <w:proofErr w:type="spellStart"/>
-            <w:r>
-              <w:rPr>
-                <w:rFonts w:ascii="Times New Roman" w:eastAsia="Times New Roman" w:hAnsi="Times New Roman" w:cs="Times New Roman"/>
-              </w:rPr>
-              <w:t>Degradation</w:t>
-            </w:r>
-            <w:proofErr w:type="spellEnd"/>
-            <w:r>
-              <w:rPr>
-                <w:rFonts w:ascii="Times New Roman" w:eastAsia="Times New Roman" w:hAnsi="Times New Roman" w:cs="Times New Roman"/>
-              </w:rPr>
-              <w:t xml:space="preserve">: si el servicio de precios dinámicos falla, el sistema </w:t>
+            <w:r>
+              <w:rPr>
+                <w:rFonts w:ascii="Times New Roman" w:eastAsia="Times New Roman" w:hAnsi="Times New Roman" w:cs="Times New Roman"/>
+              </w:rPr>
+              <w:t xml:space="preserve"> Degradation: si el servicio de precios dinámicos falla, el sistema </w:t>
             </w:r>
             <w:r>
               <w:rPr>
@@ -2059,7 +1995,6 @@
               </w:rPr>
             </w:pPr>
             <w:bookmarkStart w:id="14" w:name="_Int_0bf9RQoT"/>
-            <w:proofErr w:type="spellStart"/>
             <w:r>
               <w:rPr>
                 <w:rFonts w:ascii="Times New Roman" w:eastAsia="Times New Roman" w:hAnsi="Times New Roman" w:cs="Times New Roman"/>
@@ -2069,7 +2004,6 @@
               <w:t>Product</w:t>
             </w:r>
             <w:bookmarkEnd w:id="14"/>
-            <w:proofErr w:type="spellEnd"/>
             <w:r>
               <w:rPr>
                 <w:rFonts w:ascii="Times New Roman" w:eastAsia="Times New Roman" w:hAnsi="Times New Roman" w:cs="Times New Roman"/>
@@ -2097,7 +2031,6 @@
               <w:t xml:space="preserve"> / PO y Desarrollador </w:t>
             </w:r>
             <w:bookmarkStart w:id="16" w:name="_Int_lE3yUTzu"/>
-            <w:proofErr w:type="spellStart"/>
             <w:r>
               <w:rPr>
                 <w:rFonts w:ascii="Times New Roman" w:eastAsia="Times New Roman" w:hAnsi="Times New Roman" w:cs="Times New Roman"/>
@@ -2107,7 +2040,6 @@
               <w:t>FullStack</w:t>
             </w:r>
             <w:bookmarkEnd w:id="16"/>
-            <w:proofErr w:type="spellEnd"/>
           </w:p>
         </w:tc>
         <w:tc>
@@ -2128,7 +2060,6 @@
               <w:t xml:space="preserve">José Francisco Quezada </w:t>
             </w:r>
             <w:bookmarkStart w:id="17" w:name="_Int_9CzjsgYz"/>
-            <w:proofErr w:type="spellStart"/>
             <w:r>
               <w:rPr>
                 <w:rFonts w:ascii="Times New Roman" w:eastAsia="Times New Roman" w:hAnsi="Times New Roman" w:cs="Times New Roman"/>
@@ -2136,7 +2067,6 @@
               <w:t>Quezada</w:t>
             </w:r>
             <w:bookmarkEnd w:id="17"/>
-            <w:proofErr w:type="spellEnd"/>
           </w:p>
         </w:tc>
         <w:tc>
@@ -2349,7 +2279,6 @@
               </w:rPr>
             </w:pPr>
             <w:bookmarkStart w:id="20" w:name="_Int_rywbBZjb"/>
-            <w:proofErr w:type="spellStart"/>
             <w:r>
               <w:rPr>
                 <w:rFonts w:ascii="Times New Roman" w:eastAsia="Times New Roman" w:hAnsi="Times New Roman" w:cs="Times New Roman"/>
@@ -2359,7 +2288,6 @@
               <w:t>Stakeholder</w:t>
             </w:r>
             <w:bookmarkEnd w:id="20"/>
-            <w:proofErr w:type="spellEnd"/>
             <w:r>
               <w:rPr>
                 <w:rFonts w:ascii="Times New Roman" w:eastAsia="Times New Roman" w:hAnsi="Times New Roman" w:cs="Times New Roman"/>
@@ -2922,21 +2850,7 @@
               <w:rPr>
                 <w:rFonts w:ascii="Times New Roman" w:eastAsia="Times New Roman" w:hAnsi="Times New Roman" w:cs="Times New Roman"/>
               </w:rPr>
-              <w:t xml:space="preserve">Entorno de Desarrollo Integrado (IDE) principal con extensiones para Node.js y </w:t>
-            </w:r>
-            <w:proofErr w:type="spellStart"/>
-            <w:r>
-              <w:rPr>
-                <w:rFonts w:ascii="Times New Roman" w:eastAsia="Times New Roman" w:hAnsi="Times New Roman" w:cs="Times New Roman"/>
-              </w:rPr>
-              <w:t>React</w:t>
-            </w:r>
-            <w:proofErr w:type="spellEnd"/>
-            <w:r>
-              <w:rPr>
-                <w:rFonts w:ascii="Times New Roman" w:eastAsia="Times New Roman" w:hAnsi="Times New Roman" w:cs="Times New Roman"/>
-              </w:rPr>
-              <w:t>.</w:t>
+              <w:t>Entorno de Desarrollo Integrado (IDE) principal con extensiones para Node.js y React.</w:t>
             </w:r>
           </w:p>
           <w:p>
@@ -3071,7 +2985,6 @@
                 <w:bCs w:val="0"/>
               </w:rPr>
             </w:pPr>
-            <w:proofErr w:type="spellStart"/>
             <w:r>
               <w:rPr>
                 <w:rFonts w:ascii="Times New Roman" w:eastAsia="Times New Roman" w:hAnsi="Times New Roman" w:cs="Times New Roman"/>
@@ -3080,7 +2993,6 @@
               </w:rPr>
               <w:t>Github</w:t>
             </w:r>
-            <w:proofErr w:type="spellEnd"/>
           </w:p>
         </w:tc>
         <w:tc>
@@ -3172,21 +3084,7 @@
               <w:rPr>
                 <w:rFonts w:ascii="Times New Roman" w:eastAsia="Times New Roman" w:hAnsi="Times New Roman" w:cs="Times New Roman"/>
               </w:rPr>
-              <w:t xml:space="preserve">Entorno de ejecución de JavaScript para el </w:t>
-            </w:r>
-            <w:proofErr w:type="spellStart"/>
-            <w:r>
-              <w:rPr>
-                <w:rFonts w:ascii="Times New Roman" w:eastAsia="Times New Roman" w:hAnsi="Times New Roman" w:cs="Times New Roman"/>
-              </w:rPr>
-              <w:t>Backend</w:t>
-            </w:r>
-            <w:proofErr w:type="spellEnd"/>
-            <w:r>
-              <w:rPr>
-                <w:rFonts w:ascii="Times New Roman" w:eastAsia="Times New Roman" w:hAnsi="Times New Roman" w:cs="Times New Roman"/>
-              </w:rPr>
-              <w:t>.</w:t>
+              <w:t>Entorno de ejecución de JavaScript para el Backend.</w:t>
             </w:r>
           </w:p>
           <w:p>
@@ -3417,63 +3315,7 @@
               <w:rPr>
                 <w:rFonts w:ascii="Times New Roman" w:eastAsia="Times New Roman" w:hAnsi="Times New Roman" w:cs="Times New Roman"/>
               </w:rPr>
-              <w:t xml:space="preserve">Herramienta para probar las </w:t>
-            </w:r>
-            <w:proofErr w:type="spellStart"/>
-            <w:r>
-              <w:rPr>
-                <w:rFonts w:ascii="Times New Roman" w:eastAsia="Times New Roman" w:hAnsi="Times New Roman" w:cs="Times New Roman"/>
-              </w:rPr>
-              <w:t>APIs</w:t>
-            </w:r>
-            <w:proofErr w:type="spellEnd"/>
-            <w:r>
-              <w:rPr>
-                <w:rFonts w:ascii="Times New Roman" w:eastAsia="Times New Roman" w:hAnsi="Times New Roman" w:cs="Times New Roman"/>
-              </w:rPr>
-              <w:t xml:space="preserve"> /</w:t>
-            </w:r>
-            <w:proofErr w:type="spellStart"/>
-            <w:r>
-              <w:rPr>
-                <w:rFonts w:ascii="Times New Roman" w:eastAsia="Times New Roman" w:hAnsi="Times New Roman" w:cs="Times New Roman"/>
-              </w:rPr>
-              <w:t>Endpoints</w:t>
-            </w:r>
-            <w:proofErr w:type="spellEnd"/>
-            <w:r>
-              <w:rPr>
-                <w:rFonts w:ascii="Times New Roman" w:eastAsia="Times New Roman" w:hAnsi="Times New Roman" w:cs="Times New Roman"/>
-              </w:rPr>
-              <w:t xml:space="preserve">/ y conexiones </w:t>
-            </w:r>
-            <w:proofErr w:type="spellStart"/>
-            <w:r>
-              <w:rPr>
-                <w:rFonts w:ascii="Times New Roman" w:eastAsia="Times New Roman" w:hAnsi="Times New Roman" w:cs="Times New Roman"/>
-              </w:rPr>
-              <w:t>WebSockets</w:t>
-            </w:r>
-            <w:proofErr w:type="spellEnd"/>
-            <w:r>
-              <w:rPr>
-                <w:rFonts w:ascii="Times New Roman" w:eastAsia="Times New Roman" w:hAnsi="Times New Roman" w:cs="Times New Roman"/>
-              </w:rPr>
-              <w:t xml:space="preserve"> antes de tener el </w:t>
-            </w:r>
-            <w:proofErr w:type="spellStart"/>
-            <w:r>
-              <w:rPr>
-                <w:rFonts w:ascii="Times New Roman" w:eastAsia="Times New Roman" w:hAnsi="Times New Roman" w:cs="Times New Roman"/>
-              </w:rPr>
-              <w:t>Frontend</w:t>
-            </w:r>
-            <w:proofErr w:type="spellEnd"/>
-            <w:r>
-              <w:rPr>
-                <w:rFonts w:ascii="Times New Roman" w:eastAsia="Times New Roman" w:hAnsi="Times New Roman" w:cs="Times New Roman"/>
-              </w:rPr>
-              <w:t>.</w:t>
+              <w:t>Herramienta para probar las APIs /Endpoints/ y conexiones WebSockets antes de tener el Frontend.</w:t>
             </w:r>
           </w:p>
           <w:p>
@@ -3522,7 +3364,6 @@
                 <w:bCs w:val="0"/>
               </w:rPr>
             </w:pPr>
-            <w:proofErr w:type="spellStart"/>
             <w:r>
               <w:rPr>
                 <w:rFonts w:ascii="Times New Roman" w:eastAsia="Times New Roman" w:hAnsi="Times New Roman" w:cs="Times New Roman"/>
@@ -3531,7 +3372,6 @@
               </w:rPr>
               <w:t>DBeaver</w:t>
             </w:r>
-            <w:proofErr w:type="spellEnd"/>
           </w:p>
         </w:tc>
         <w:tc>
@@ -3598,7 +3438,6 @@
                 <w:bCs w:val="0"/>
               </w:rPr>
             </w:pPr>
-            <w:proofErr w:type="spellStart"/>
             <w:r>
               <w:rPr>
                 <w:rFonts w:ascii="Times New Roman" w:eastAsia="Times New Roman" w:hAnsi="Times New Roman" w:cs="Times New Roman"/>
@@ -3607,7 +3446,6 @@
               </w:rPr>
               <w:t>Figma</w:t>
             </w:r>
-            <w:proofErr w:type="spellEnd"/>
           </w:p>
         </w:tc>
         <w:tc>
@@ -3699,35 +3537,7 @@
               <w:rPr>
                 <w:rFonts w:ascii="Times New Roman" w:eastAsia="Times New Roman" w:hAnsi="Times New Roman" w:cs="Times New Roman"/>
               </w:rPr>
-              <w:t xml:space="preserve">Navegador web con </w:t>
-            </w:r>
-            <w:proofErr w:type="spellStart"/>
-            <w:r>
-              <w:rPr>
-                <w:rFonts w:ascii="Times New Roman" w:eastAsia="Times New Roman" w:hAnsi="Times New Roman" w:cs="Times New Roman"/>
-              </w:rPr>
-              <w:t>DevTools</w:t>
-            </w:r>
-            <w:proofErr w:type="spellEnd"/>
-            <w:r>
-              <w:rPr>
-                <w:rFonts w:ascii="Times New Roman" w:eastAsia="Times New Roman" w:hAnsi="Times New Roman" w:cs="Times New Roman"/>
-              </w:rPr>
-              <w:t xml:space="preserve"> avanzadas para depurar la PWA, Service </w:t>
-            </w:r>
-            <w:proofErr w:type="spellStart"/>
-            <w:r>
-              <w:rPr>
-                <w:rFonts w:ascii="Times New Roman" w:eastAsia="Times New Roman" w:hAnsi="Times New Roman" w:cs="Times New Roman"/>
-              </w:rPr>
-              <w:t>Workers</w:t>
-            </w:r>
-            <w:proofErr w:type="spellEnd"/>
-            <w:r>
-              <w:rPr>
-                <w:rFonts w:ascii="Times New Roman" w:eastAsia="Times New Roman" w:hAnsi="Times New Roman" w:cs="Times New Roman"/>
-              </w:rPr>
-              <w:t xml:space="preserve"> y almacenamiento local.</w:t>
+              <w:t>Navegador web con DevTools avanzadas para depurar la PWA, Service Workers y almacenamiento local.</w:t>
             </w:r>
           </w:p>
         </w:tc>
@@ -4108,21 +3918,7 @@
               <w:rPr>
                 <w:rFonts w:ascii="Times New Roman" w:eastAsia="Times New Roman" w:hAnsi="Times New Roman" w:cs="Times New Roman"/>
               </w:rPr>
-              <w:t>Smartphone Gama Media/Alta (</w:t>
-            </w:r>
-            <w:proofErr w:type="spellStart"/>
-            <w:r>
-              <w:rPr>
-                <w:rFonts w:ascii="Times New Roman" w:eastAsia="Times New Roman" w:hAnsi="Times New Roman" w:cs="Times New Roman"/>
-              </w:rPr>
-              <w:t>Testing</w:t>
-            </w:r>
-            <w:proofErr w:type="spellEnd"/>
-            <w:r>
-              <w:rPr>
-                <w:rFonts w:ascii="Times New Roman" w:eastAsia="Times New Roman" w:hAnsi="Times New Roman" w:cs="Times New Roman"/>
-              </w:rPr>
-              <w:t xml:space="preserve"> PWA y QR)</w:t>
+              <w:t>Smartphone Gama Media/Alta (Testing PWA y QR)</w:t>
             </w:r>
           </w:p>
           <w:p>
@@ -4401,21 +4197,7 @@
               <w:rPr>
                 <w:rFonts w:ascii="Times New Roman" w:eastAsia="Times New Roman" w:hAnsi="Times New Roman" w:cs="Times New Roman"/>
               </w:rPr>
-              <w:t>Infraestructura Cloud (</w:t>
-            </w:r>
-            <w:proofErr w:type="spellStart"/>
-            <w:r>
-              <w:rPr>
-                <w:rFonts w:ascii="Times New Roman" w:eastAsia="Times New Roman" w:hAnsi="Times New Roman" w:cs="Times New Roman"/>
-              </w:rPr>
-              <w:t>Railway</w:t>
-            </w:r>
-            <w:proofErr w:type="spellEnd"/>
-            <w:r>
-              <w:rPr>
-                <w:rFonts w:ascii="Times New Roman" w:eastAsia="Times New Roman" w:hAnsi="Times New Roman" w:cs="Times New Roman"/>
-              </w:rPr>
-              <w:t>/Render - Tier Hobby)</w:t>
+              <w:t>Infraestructura Cloud (Railway/Render - Tier Hobby)</w:t>
             </w:r>
           </w:p>
           <w:p>
@@ -4508,21 +4290,7 @@
               <w:rPr>
                 <w:rFonts w:ascii="Times New Roman" w:eastAsia="Times New Roman" w:hAnsi="Times New Roman" w:cs="Times New Roman"/>
               </w:rPr>
-              <w:t>Dominio Web (.</w:t>
-            </w:r>
-            <w:proofErr w:type="spellStart"/>
-            <w:r>
-              <w:rPr>
-                <w:rFonts w:ascii="Times New Roman" w:eastAsia="Times New Roman" w:hAnsi="Times New Roman" w:cs="Times New Roman"/>
-              </w:rPr>
-              <w:t>com</w:t>
-            </w:r>
-            <w:proofErr w:type="spellEnd"/>
-            <w:r>
-              <w:rPr>
-                <w:rFonts w:ascii="Times New Roman" w:eastAsia="Times New Roman" w:hAnsi="Times New Roman" w:cs="Times New Roman"/>
-              </w:rPr>
-              <w:t xml:space="preserve"> o .app para producción)</w:t>
+              <w:t>Dominio Web (.com o .app para producción)</w:t>
             </w:r>
           </w:p>
           <w:p>
@@ -4842,33 +4610,11 @@
                 <w:rFonts w:ascii="Times New Roman" w:eastAsia="Times New Roman" w:hAnsi="Times New Roman" w:cs="Times New Roman"/>
               </w:rPr>
             </w:pPr>
-            <w:proofErr w:type="spellStart"/>
-            <w:r>
-              <w:rPr>
-                <w:rFonts w:ascii="Times New Roman" w:eastAsia="Times New Roman" w:hAnsi="Times New Roman" w:cs="Times New Roman"/>
-              </w:rPr>
-              <w:t>Race</w:t>
-            </w:r>
-            <w:proofErr w:type="spellEnd"/>
-            <w:r>
-              <w:rPr>
-                <w:rFonts w:ascii="Times New Roman" w:eastAsia="Times New Roman" w:hAnsi="Times New Roman" w:cs="Times New Roman"/>
-              </w:rPr>
-              <w:t xml:space="preserve"> </w:t>
-            </w:r>
-            <w:proofErr w:type="spellStart"/>
-            <w:r>
-              <w:rPr>
-                <w:rFonts w:ascii="Times New Roman" w:eastAsia="Times New Roman" w:hAnsi="Times New Roman" w:cs="Times New Roman"/>
-              </w:rPr>
-              <w:t>Conditions</w:t>
-            </w:r>
-            <w:proofErr w:type="spellEnd"/>
-            <w:r>
-              <w:rPr>
-                <w:rFonts w:ascii="Times New Roman" w:eastAsia="Times New Roman" w:hAnsi="Times New Roman" w:cs="Times New Roman"/>
-              </w:rPr>
-              <w:t xml:space="preserve"> (Condición de Carrera) en reservas simultáneas. Dos usuarios intentan comprar el último cupo al mismo milisegundo.</w:t>
+            <w:r>
+              <w:rPr>
+                <w:rFonts w:ascii="Times New Roman" w:eastAsia="Times New Roman" w:hAnsi="Times New Roman" w:cs="Times New Roman"/>
+              </w:rPr>
+              <w:t>Race Conditions (Condición de Carrera) en reservas simultáneas. Dos usuarios intentan comprar el último cupo al mismo milisegundo.</w:t>
             </w:r>
           </w:p>
           <w:p>
@@ -4969,21 +4715,7 @@
               <w:rPr>
                 <w:rFonts w:ascii="Times New Roman" w:eastAsia="Times New Roman" w:hAnsi="Times New Roman" w:cs="Times New Roman"/>
               </w:rPr>
-              <w:t xml:space="preserve">Desbordamiento del Alcance (Scope Creep). Intentar implementar algoritmos complejos (IA real) en lugar de reglas simples para el Smart </w:t>
-            </w:r>
-            <w:proofErr w:type="spellStart"/>
-            <w:r>
-              <w:rPr>
-                <w:rFonts w:ascii="Times New Roman" w:eastAsia="Times New Roman" w:hAnsi="Times New Roman" w:cs="Times New Roman"/>
-              </w:rPr>
-              <w:t>Pricing</w:t>
-            </w:r>
-            <w:proofErr w:type="spellEnd"/>
-            <w:r>
-              <w:rPr>
-                <w:rFonts w:ascii="Times New Roman" w:eastAsia="Times New Roman" w:hAnsi="Times New Roman" w:cs="Times New Roman"/>
-              </w:rPr>
-              <w:t>.</w:t>
+              <w:t>Desbordamiento del Alcance (Scope Creep). Intentar implementar algoritmos complejos (IA real) en lugar de reglas simples para el Smart Pricing.</w:t>
             </w:r>
           </w:p>
           <w:p>
@@ -5184,49 +4916,7 @@
               <w:rPr>
                 <w:rFonts w:ascii="Times New Roman" w:eastAsia="Times New Roman" w:hAnsi="Times New Roman" w:cs="Times New Roman"/>
               </w:rPr>
-              <w:t>Dependencia total de un solo desarrollador para un módulo crítico (</w:t>
-            </w:r>
-            <w:proofErr w:type="spellStart"/>
-            <w:r>
-              <w:rPr>
-                <w:rFonts w:ascii="Times New Roman" w:eastAsia="Times New Roman" w:hAnsi="Times New Roman" w:cs="Times New Roman"/>
-              </w:rPr>
-              <w:t>ej</w:t>
-            </w:r>
-            <w:proofErr w:type="spellEnd"/>
-            <w:r>
-              <w:rPr>
-                <w:rFonts w:ascii="Times New Roman" w:eastAsia="Times New Roman" w:hAnsi="Times New Roman" w:cs="Times New Roman"/>
-              </w:rPr>
-              <w:t xml:space="preserve">: Solo Jose sabe </w:t>
-            </w:r>
-            <w:proofErr w:type="spellStart"/>
-            <w:r>
-              <w:rPr>
-                <w:rFonts w:ascii="Times New Roman" w:eastAsia="Times New Roman" w:hAnsi="Times New Roman" w:cs="Times New Roman"/>
-              </w:rPr>
-              <w:t>Frontend</w:t>
-            </w:r>
-            <w:proofErr w:type="spellEnd"/>
-            <w:r>
-              <w:rPr>
-                <w:rFonts w:ascii="Times New Roman" w:eastAsia="Times New Roman" w:hAnsi="Times New Roman" w:cs="Times New Roman"/>
-              </w:rPr>
-              <w:t xml:space="preserve"> o solo Cristhofer sabe </w:t>
-            </w:r>
-            <w:proofErr w:type="spellStart"/>
-            <w:r>
-              <w:rPr>
-                <w:rFonts w:ascii="Times New Roman" w:eastAsia="Times New Roman" w:hAnsi="Times New Roman" w:cs="Times New Roman"/>
-              </w:rPr>
-              <w:t>Backend</w:t>
-            </w:r>
-            <w:proofErr w:type="spellEnd"/>
-            <w:r>
-              <w:rPr>
-                <w:rFonts w:ascii="Times New Roman" w:eastAsia="Times New Roman" w:hAnsi="Times New Roman" w:cs="Times New Roman"/>
-              </w:rPr>
-              <w:t>).</w:t>
+              <w:t>Dependencia total de un solo desarrollador para un módulo crítico (ej: Solo Jose sabe Frontend o solo Cristhofer sabe Backend).</w:t>
             </w:r>
           </w:p>
           <w:p>
@@ -5272,21 +4962,7 @@
               <w:rPr>
                 <w:rFonts w:ascii="Times New Roman" w:eastAsia="Times New Roman" w:hAnsi="Times New Roman" w:cs="Times New Roman"/>
               </w:rPr>
-              <w:t xml:space="preserve">Si uno de los dos enfermó, o tiene una calamidad doméstica, el desarrollo del proyecto se detiene completamente, incumpliendo los </w:t>
-            </w:r>
-            <w:proofErr w:type="spellStart"/>
-            <w:r>
-              <w:rPr>
-                <w:rFonts w:ascii="Times New Roman" w:eastAsia="Times New Roman" w:hAnsi="Times New Roman" w:cs="Times New Roman"/>
-              </w:rPr>
-              <w:t>sprints</w:t>
-            </w:r>
-            <w:proofErr w:type="spellEnd"/>
-            <w:r>
-              <w:rPr>
-                <w:rFonts w:ascii="Times New Roman" w:eastAsia="Times New Roman" w:hAnsi="Times New Roman" w:cs="Times New Roman"/>
-              </w:rPr>
-              <w:t>.</w:t>
+              <w:t>Si uno de los dos enfermó, o tiene una calamidad doméstica, el desarrollo del proyecto se detiene completamente, incumpliendo los sprints.</w:t>
             </w:r>
           </w:p>
           <w:p>
@@ -5341,35 +5017,7 @@
               <w:rPr>
                 <w:rFonts w:ascii="Times New Roman" w:eastAsia="Times New Roman" w:hAnsi="Times New Roman" w:cs="Times New Roman"/>
               </w:rPr>
-              <w:t xml:space="preserve">Latencia en </w:t>
-            </w:r>
-            <w:proofErr w:type="spellStart"/>
-            <w:r>
-              <w:rPr>
-                <w:rFonts w:ascii="Times New Roman" w:eastAsia="Times New Roman" w:hAnsi="Times New Roman" w:cs="Times New Roman"/>
-              </w:rPr>
-              <w:t>WebSockets</w:t>
-            </w:r>
-            <w:proofErr w:type="spellEnd"/>
-            <w:r>
-              <w:rPr>
-                <w:rFonts w:ascii="Times New Roman" w:eastAsia="Times New Roman" w:hAnsi="Times New Roman" w:cs="Times New Roman"/>
-              </w:rPr>
-              <w:t>. Saturación del servidor Node.js por mal manejo de conexiones abiertas en el módulo de chat/</w:t>
-            </w:r>
-            <w:proofErr w:type="spellStart"/>
-            <w:r>
-              <w:rPr>
-                <w:rFonts w:ascii="Times New Roman" w:eastAsia="Times New Roman" w:hAnsi="Times New Roman" w:cs="Times New Roman"/>
-              </w:rPr>
-              <w:t>matchmaking</w:t>
-            </w:r>
-            <w:proofErr w:type="spellEnd"/>
-            <w:r>
-              <w:rPr>
-                <w:rFonts w:ascii="Times New Roman" w:eastAsia="Times New Roman" w:hAnsi="Times New Roman" w:cs="Times New Roman"/>
-              </w:rPr>
-              <w:t>.</w:t>
+              <w:t>Latencia en WebSockets. Saturación del servidor Node.js por mal manejo de conexiones abiertas en el módulo de chat/matchmaking.</w:t>
             </w:r>
           </w:p>
           <w:p>
@@ -5415,21 +5063,7 @@
               <w:rPr>
                 <w:rFonts w:ascii="Times New Roman" w:eastAsia="Times New Roman" w:hAnsi="Times New Roman" w:cs="Times New Roman"/>
               </w:rPr>
-              <w:t>Caída del servidor, desconexión de usuarios y lentitud general en la aplicación (</w:t>
-            </w:r>
-            <w:proofErr w:type="spellStart"/>
-            <w:r>
-              <w:rPr>
-                <w:rFonts w:ascii="Times New Roman" w:eastAsia="Times New Roman" w:hAnsi="Times New Roman" w:cs="Times New Roman"/>
-              </w:rPr>
-              <w:t>Lag</w:t>
-            </w:r>
-            <w:proofErr w:type="spellEnd"/>
-            <w:r>
-              <w:rPr>
-                <w:rFonts w:ascii="Times New Roman" w:eastAsia="Times New Roman" w:hAnsi="Times New Roman" w:cs="Times New Roman"/>
-              </w:rPr>
-              <w:t>), afectando la experiencia "Real-Time".</w:t>
+              <w:t>Caída del servidor, desconexión de usuarios y lentitud general en la aplicación (Lag), afectando la experiencia "Real-Time".</w:t>
             </w:r>
           </w:p>
           <w:p>
@@ -5825,23 +5459,13 @@
                 <w:bCs/>
               </w:rPr>
             </w:pPr>
-            <w:proofErr w:type="spellStart"/>
             <w:r>
               <w:rPr>
                 <w:rFonts w:ascii="Times New Roman" w:eastAsia="Times New Roman" w:hAnsi="Times New Roman" w:cs="Times New Roman"/>
                 <w:b/>
                 <w:bCs/>
               </w:rPr>
-              <w:t>Prob</w:t>
-            </w:r>
-            <w:proofErr w:type="spellEnd"/>
-            <w:r>
-              <w:rPr>
-                <w:rFonts w:ascii="Times New Roman" w:eastAsia="Times New Roman" w:hAnsi="Times New Roman" w:cs="Times New Roman"/>
-                <w:b/>
-                <w:bCs/>
-              </w:rPr>
-              <w:t>.</w:t>
+              <w:t>Prob.</w:t>
             </w:r>
           </w:p>
         </w:tc>
@@ -5893,23 +5517,13 @@
                 <w:bCs/>
               </w:rPr>
             </w:pPr>
-            <w:proofErr w:type="spellStart"/>
             <w:r>
               <w:rPr>
                 <w:rFonts w:ascii="Times New Roman" w:eastAsia="Times New Roman" w:hAnsi="Times New Roman" w:cs="Times New Roman"/>
                 <w:b/>
                 <w:bCs/>
               </w:rPr>
-              <w:t>Prob</w:t>
-            </w:r>
-            <w:proofErr w:type="spellEnd"/>
-            <w:r>
-              <w:rPr>
-                <w:rFonts w:ascii="Times New Roman" w:eastAsia="Times New Roman" w:hAnsi="Times New Roman" w:cs="Times New Roman"/>
-                <w:b/>
-                <w:bCs/>
-              </w:rPr>
-              <w:t>.</w:t>
+              <w:t>Prob.</w:t>
             </w:r>
           </w:p>
         </w:tc>
@@ -5961,23 +5575,13 @@
                 <w:bCs/>
               </w:rPr>
             </w:pPr>
-            <w:proofErr w:type="spellStart"/>
             <w:r>
               <w:rPr>
                 <w:rFonts w:ascii="Times New Roman" w:eastAsia="Times New Roman" w:hAnsi="Times New Roman" w:cs="Times New Roman"/>
                 <w:b/>
                 <w:bCs/>
               </w:rPr>
-              <w:t>Prob</w:t>
-            </w:r>
-            <w:proofErr w:type="spellEnd"/>
-            <w:r>
-              <w:rPr>
-                <w:rFonts w:ascii="Times New Roman" w:eastAsia="Times New Roman" w:hAnsi="Times New Roman" w:cs="Times New Roman"/>
-                <w:b/>
-                <w:bCs/>
-              </w:rPr>
-              <w:t>.</w:t>
+              <w:t>Prob.</w:t>
             </w:r>
           </w:p>
         </w:tc>
@@ -6029,55 +5633,7 @@
                 <w:rFonts w:ascii="Times New Roman" w:eastAsia="Times New Roman" w:hAnsi="Times New Roman" w:cs="Times New Roman"/>
                 <w:lang w:val="en-US"/>
               </w:rPr>
-              <w:t xml:space="preserve">Race Conditions </w:t>
-            </w:r>
-            <w:proofErr w:type="spellStart"/>
-            <w:r>
-              <w:rPr>
-                <w:rFonts w:ascii="Times New Roman" w:eastAsia="Times New Roman" w:hAnsi="Times New Roman" w:cs="Times New Roman"/>
-                <w:lang w:val="en-US"/>
-              </w:rPr>
-              <w:t>en</w:t>
-            </w:r>
-            <w:proofErr w:type="spellEnd"/>
-            <w:r>
-              <w:rPr>
-                <w:rFonts w:ascii="Times New Roman" w:eastAsia="Times New Roman" w:hAnsi="Times New Roman" w:cs="Times New Roman"/>
-                <w:lang w:val="en-US"/>
-              </w:rPr>
-              <w:t xml:space="preserve"> </w:t>
-            </w:r>
-            <w:proofErr w:type="spellStart"/>
-            <w:r>
-              <w:rPr>
-                <w:rFonts w:ascii="Times New Roman" w:eastAsia="Times New Roman" w:hAnsi="Times New Roman" w:cs="Times New Roman"/>
-                <w:lang w:val="en-US"/>
-              </w:rPr>
-              <w:t>reservas</w:t>
-            </w:r>
-            <w:proofErr w:type="spellEnd"/>
-            <w:r>
-              <w:rPr>
-                <w:rFonts w:ascii="Times New Roman" w:eastAsia="Times New Roman" w:hAnsi="Times New Roman" w:cs="Times New Roman"/>
-                <w:lang w:val="en-US"/>
-              </w:rPr>
-              <w:t xml:space="preserve"> </w:t>
-            </w:r>
-            <w:proofErr w:type="spellStart"/>
-            <w:r>
-              <w:rPr>
-                <w:rFonts w:ascii="Times New Roman" w:eastAsia="Times New Roman" w:hAnsi="Times New Roman" w:cs="Times New Roman"/>
-                <w:lang w:val="en-US"/>
-              </w:rPr>
-              <w:t>simultáneas</w:t>
-            </w:r>
-            <w:proofErr w:type="spellEnd"/>
-            <w:r>
-              <w:rPr>
-                <w:rFonts w:ascii="Times New Roman" w:eastAsia="Times New Roman" w:hAnsi="Times New Roman" w:cs="Times New Roman"/>
-                <w:lang w:val="en-US"/>
-              </w:rPr>
-              <w:t xml:space="preserve"> (RF-001).</w:t>
+              <w:t>Race Conditions en reservas simultáneas (RF-001).</w:t>
             </w:r>
           </w:p>
           <w:p>
@@ -6944,21 +6500,7 @@
               <w:rPr>
                 <w:rFonts w:ascii="Times New Roman" w:eastAsia="Times New Roman" w:hAnsi="Times New Roman" w:cs="Times New Roman"/>
               </w:rPr>
-              <w:t xml:space="preserve">Latencia en </w:t>
-            </w:r>
-            <w:proofErr w:type="spellStart"/>
-            <w:r>
-              <w:rPr>
-                <w:rFonts w:ascii="Times New Roman" w:eastAsia="Times New Roman" w:hAnsi="Times New Roman" w:cs="Times New Roman"/>
-              </w:rPr>
-              <w:t>WebSockets</w:t>
-            </w:r>
-            <w:proofErr w:type="spellEnd"/>
-            <w:r>
-              <w:rPr>
-                <w:rFonts w:ascii="Times New Roman" w:eastAsia="Times New Roman" w:hAnsi="Times New Roman" w:cs="Times New Roman"/>
-              </w:rPr>
-              <w:t xml:space="preserve"> (RNF-004).</w:t>
+              <w:t>Latencia en WebSockets (RNF-004).</w:t>
             </w:r>
           </w:p>
           <w:p>
@@ -7576,43 +7118,7 @@
                 <w:b w:val="0"/>
                 <w:bCs w:val="0"/>
               </w:rPr>
-              <w:t xml:space="preserve"> Condición de carrera (</w:t>
-            </w:r>
-            <w:proofErr w:type="spellStart"/>
-            <w:r>
-              <w:rPr>
-                <w:rFonts w:ascii="Times New Roman" w:eastAsia="Times New Roman" w:hAnsi="Times New Roman" w:cs="Times New Roman"/>
-                <w:b w:val="0"/>
-                <w:bCs w:val="0"/>
-              </w:rPr>
-              <w:t>Race</w:t>
-            </w:r>
-            <w:proofErr w:type="spellEnd"/>
-            <w:r>
-              <w:rPr>
-                <w:rFonts w:ascii="Times New Roman" w:eastAsia="Times New Roman" w:hAnsi="Times New Roman" w:cs="Times New Roman"/>
-                <w:b w:val="0"/>
-                <w:bCs w:val="0"/>
-              </w:rPr>
-              <w:t xml:space="preserve"> </w:t>
-            </w:r>
-            <w:proofErr w:type="spellStart"/>
-            <w:r>
-              <w:rPr>
-                <w:rFonts w:ascii="Times New Roman" w:eastAsia="Times New Roman" w:hAnsi="Times New Roman" w:cs="Times New Roman"/>
-                <w:b w:val="0"/>
-                <w:bCs w:val="0"/>
-              </w:rPr>
-              <w:t>Condition</w:t>
-            </w:r>
-            <w:proofErr w:type="spellEnd"/>
-            <w:r>
-              <w:rPr>
-                <w:rFonts w:ascii="Times New Roman" w:eastAsia="Times New Roman" w:hAnsi="Times New Roman" w:cs="Times New Roman"/>
-                <w:b w:val="0"/>
-                <w:bCs w:val="0"/>
-              </w:rPr>
-              <w:t>) en reservas simultáneas.</w:t>
+              <w:t xml:space="preserve"> Condición de carrera (Race Condition) en reservas simultáneas.</w:t>
             </w:r>
           </w:p>
           <w:p>
@@ -7693,25 +7199,7 @@
                 <w:b w:val="0"/>
                 <w:bCs w:val="0"/>
               </w:rPr>
-              <w:t xml:space="preserve">Naturaleza asíncrona del </w:t>
-            </w:r>
-            <w:proofErr w:type="spellStart"/>
-            <w:r>
-              <w:rPr>
-                <w:rFonts w:ascii="Times New Roman" w:eastAsia="Times New Roman" w:hAnsi="Times New Roman" w:cs="Times New Roman"/>
-                <w:b w:val="0"/>
-                <w:bCs w:val="0"/>
-              </w:rPr>
-              <w:t>Event</w:t>
-            </w:r>
-            <w:proofErr w:type="spellEnd"/>
-            <w:r>
-              <w:rPr>
-                <w:rFonts w:ascii="Times New Roman" w:eastAsia="Times New Roman" w:hAnsi="Times New Roman" w:cs="Times New Roman"/>
-                <w:b w:val="0"/>
-                <w:bCs w:val="0"/>
-              </w:rPr>
-              <w:t xml:space="preserve"> Loop de Node.js sin bloqueo nativo.</w:t>
+              <w:t>Naturaleza asíncrona del Event Loop de Node.js sin bloqueo nativo.</w:t>
             </w:r>
           </w:p>
           <w:p>
@@ -7843,25 +7331,7 @@
                 <w:b w:val="0"/>
                 <w:bCs w:val="0"/>
               </w:rPr>
-              <w:t>Implementar transacciones ACID estrictas usando Prisma.$</w:t>
-            </w:r>
-            <w:proofErr w:type="spellStart"/>
-            <w:r>
-              <w:rPr>
-                <w:rFonts w:ascii="Times New Roman" w:eastAsia="Times New Roman" w:hAnsi="Times New Roman" w:cs="Times New Roman"/>
-                <w:b w:val="0"/>
-                <w:bCs w:val="0"/>
-              </w:rPr>
-              <w:t>transaction</w:t>
-            </w:r>
-            <w:proofErr w:type="spellEnd"/>
-            <w:r>
-              <w:rPr>
-                <w:rFonts w:ascii="Times New Roman" w:eastAsia="Times New Roman" w:hAnsi="Times New Roman" w:cs="Times New Roman"/>
-                <w:b w:val="0"/>
-                <w:bCs w:val="0"/>
-              </w:rPr>
-              <w:t>.</w:t>
+              <w:t>Implementar transacciones ACID estrictas usando Prisma.$transaction.</w:t>
             </w:r>
           </w:p>
           <w:p>
@@ -7895,25 +7365,7 @@
                 <w:b w:val="0"/>
                 <w:bCs w:val="0"/>
               </w:rPr>
-              <w:t xml:space="preserve">Realizar pruebas de carga con </w:t>
-            </w:r>
-            <w:proofErr w:type="spellStart"/>
-            <w:r>
-              <w:rPr>
-                <w:rFonts w:ascii="Times New Roman" w:eastAsia="Times New Roman" w:hAnsi="Times New Roman" w:cs="Times New Roman"/>
-                <w:b w:val="0"/>
-                <w:bCs w:val="0"/>
-              </w:rPr>
-              <w:t>JMeter</w:t>
-            </w:r>
-            <w:proofErr w:type="spellEnd"/>
-            <w:r>
-              <w:rPr>
-                <w:rFonts w:ascii="Times New Roman" w:eastAsia="Times New Roman" w:hAnsi="Times New Roman" w:cs="Times New Roman"/>
-                <w:b w:val="0"/>
-                <w:bCs w:val="0"/>
-              </w:rPr>
-              <w:t>/K6 simulando 100 peticiones por segundo.</w:t>
+              <w:t>Realizar pruebas de carga con JMeter/K6 simulando 100 peticiones por segundo.</w:t>
             </w:r>
           </w:p>
           <w:p>
@@ -7965,43 +7417,7 @@
                 <w:b w:val="0"/>
                 <w:bCs w:val="0"/>
               </w:rPr>
-              <w:t>Monitoreo de logs de base de datos en busca de errores de "</w:t>
-            </w:r>
-            <w:proofErr w:type="spellStart"/>
-            <w:r>
-              <w:rPr>
-                <w:rFonts w:ascii="Times New Roman" w:eastAsia="Times New Roman" w:hAnsi="Times New Roman" w:cs="Times New Roman"/>
-                <w:b w:val="0"/>
-                <w:bCs w:val="0"/>
-              </w:rPr>
-              <w:t>Serialization</w:t>
-            </w:r>
-            <w:proofErr w:type="spellEnd"/>
-            <w:r>
-              <w:rPr>
-                <w:rFonts w:ascii="Times New Roman" w:eastAsia="Times New Roman" w:hAnsi="Times New Roman" w:cs="Times New Roman"/>
-                <w:b w:val="0"/>
-                <w:bCs w:val="0"/>
-              </w:rPr>
-              <w:t xml:space="preserve"> </w:t>
-            </w:r>
-            <w:proofErr w:type="spellStart"/>
-            <w:r>
-              <w:rPr>
-                <w:rFonts w:ascii="Times New Roman" w:eastAsia="Times New Roman" w:hAnsi="Times New Roman" w:cs="Times New Roman"/>
-                <w:b w:val="0"/>
-                <w:bCs w:val="0"/>
-              </w:rPr>
-              <w:t>Failure</w:t>
-            </w:r>
-            <w:proofErr w:type="spellEnd"/>
-            <w:r>
-              <w:rPr>
-                <w:rFonts w:ascii="Times New Roman" w:eastAsia="Times New Roman" w:hAnsi="Times New Roman" w:cs="Times New Roman"/>
-                <w:b w:val="0"/>
-                <w:bCs w:val="0"/>
-              </w:rPr>
-              <w:t>".</w:t>
+              <w:t>Monitoreo de logs de base de datos en busca de errores de "Serialization Failure".</w:t>
             </w:r>
           </w:p>
           <w:p>
@@ -8086,25 +7502,7 @@
                 <w:b w:val="0"/>
                 <w:bCs w:val="0"/>
               </w:rPr>
-              <w:t xml:space="preserve">Contactar al usuario afectado y ofrecer un </w:t>
-            </w:r>
-            <w:proofErr w:type="spellStart"/>
-            <w:r>
-              <w:rPr>
-                <w:rFonts w:ascii="Times New Roman" w:eastAsia="Times New Roman" w:hAnsi="Times New Roman" w:cs="Times New Roman"/>
-                <w:b w:val="0"/>
-                <w:bCs w:val="0"/>
-              </w:rPr>
-              <w:t>upgrade</w:t>
-            </w:r>
-            <w:proofErr w:type="spellEnd"/>
-            <w:r>
-              <w:rPr>
-                <w:rFonts w:ascii="Times New Roman" w:eastAsia="Times New Roman" w:hAnsi="Times New Roman" w:cs="Times New Roman"/>
-                <w:b w:val="0"/>
-                <w:bCs w:val="0"/>
-              </w:rPr>
-              <w:t xml:space="preserve"> o descuento en otra fecha.</w:t>
+              <w:t>Contactar al usuario afectado y ofrecer un upgrade o descuento en otra fecha.</w:t>
             </w:r>
           </w:p>
           <w:p>
@@ -8223,25 +7621,7 @@
                 <w:b w:val="0"/>
                 <w:bCs w:val="0"/>
               </w:rPr>
-              <w:t>Cristhofer Steve Parreño Poma (</w:t>
-            </w:r>
-            <w:proofErr w:type="spellStart"/>
-            <w:r>
-              <w:rPr>
-                <w:rFonts w:ascii="Times New Roman" w:eastAsia="Times New Roman" w:hAnsi="Times New Roman" w:cs="Times New Roman"/>
-                <w:b w:val="0"/>
-                <w:bCs w:val="0"/>
-              </w:rPr>
-              <w:t>Backend</w:t>
-            </w:r>
-            <w:proofErr w:type="spellEnd"/>
-            <w:r>
-              <w:rPr>
-                <w:rFonts w:ascii="Times New Roman" w:eastAsia="Times New Roman" w:hAnsi="Times New Roman" w:cs="Times New Roman"/>
-                <w:b w:val="0"/>
-                <w:bCs w:val="0"/>
-              </w:rPr>
-              <w:t xml:space="preserve"> Lead)</w:t>
+              <w:t>Cristhofer Steve Parreño Poma (Backend Lead)</w:t>
             </w:r>
           </w:p>
         </w:tc>
@@ -8491,25 +7871,7 @@
                 <w:b w:val="0"/>
                 <w:bCs w:val="0"/>
               </w:rPr>
-              <w:t xml:space="preserve">Desbordamiento del alcance (Scope Creep) y "Gold </w:t>
-            </w:r>
-            <w:proofErr w:type="spellStart"/>
-            <w:r>
-              <w:rPr>
-                <w:rFonts w:ascii="Times New Roman" w:eastAsia="Times New Roman" w:hAnsi="Times New Roman" w:cs="Times New Roman"/>
-                <w:b w:val="0"/>
-                <w:bCs w:val="0"/>
-              </w:rPr>
-              <w:t>Plating</w:t>
-            </w:r>
-            <w:proofErr w:type="spellEnd"/>
-            <w:r>
-              <w:rPr>
-                <w:rFonts w:ascii="Times New Roman" w:eastAsia="Times New Roman" w:hAnsi="Times New Roman" w:cs="Times New Roman"/>
-                <w:b w:val="0"/>
-                <w:bCs w:val="0"/>
-              </w:rPr>
-              <w:t>".</w:t>
+              <w:t>Desbordamiento del alcance (Scope Creep) y "Gold Plating".</w:t>
             </w:r>
           </w:p>
           <w:p>
@@ -8713,25 +8075,7 @@
                 <w:b w:val="0"/>
                 <w:bCs w:val="0"/>
               </w:rPr>
-              <w:t>Crear un documento "</w:t>
-            </w:r>
-            <w:proofErr w:type="spellStart"/>
-            <w:r>
-              <w:rPr>
-                <w:rFonts w:ascii="Times New Roman" w:eastAsia="Times New Roman" w:hAnsi="Times New Roman" w:cs="Times New Roman"/>
-                <w:b w:val="0"/>
-                <w:bCs w:val="0"/>
-              </w:rPr>
-              <w:t>Icebox</w:t>
-            </w:r>
-            <w:proofErr w:type="spellEnd"/>
-            <w:r>
-              <w:rPr>
-                <w:rFonts w:ascii="Times New Roman" w:eastAsia="Times New Roman" w:hAnsi="Times New Roman" w:cs="Times New Roman"/>
-                <w:b w:val="0"/>
-                <w:bCs w:val="0"/>
-              </w:rPr>
-              <w:t>" para ideas futuras (Versión 2.0).</w:t>
+              <w:t>Crear un documento "Icebox" para ideas futuras (Versión 2.0).</w:t>
             </w:r>
           </w:p>
           <w:p>
@@ -8792,53 +8136,17 @@
                 <w:b w:val="0"/>
                 <w:bCs w:val="0"/>
               </w:rPr>
-              <w:t xml:space="preserve">Revisión del </w:t>
-            </w:r>
-            <w:proofErr w:type="spellStart"/>
-            <w:r>
-              <w:rPr>
-                <w:rFonts w:ascii="Times New Roman" w:eastAsia="Times New Roman" w:hAnsi="Times New Roman" w:cs="Times New Roman"/>
-                <w:b w:val="0"/>
-                <w:bCs w:val="0"/>
-              </w:rPr>
-              <w:t>Burndown</w:t>
-            </w:r>
-            <w:proofErr w:type="spellEnd"/>
-            <w:r>
-              <w:rPr>
-                <w:rFonts w:ascii="Times New Roman" w:eastAsia="Times New Roman" w:hAnsi="Times New Roman" w:cs="Times New Roman"/>
-                <w:b w:val="0"/>
-                <w:bCs w:val="0"/>
-              </w:rPr>
-              <w:t xml:space="preserve"> Chart en cada Sprint.</w:t>
-            </w:r>
-          </w:p>
-          <w:p>
-            <w:r>
-              <w:rPr>
-                <w:rFonts w:ascii="Times New Roman" w:eastAsia="Times New Roman" w:hAnsi="Times New Roman" w:cs="Times New Roman"/>
-                <w:b w:val="0"/>
-                <w:bCs w:val="0"/>
-              </w:rPr>
-              <w:t>Validación semanal de avances con el tutor/</w:t>
-            </w:r>
-            <w:proofErr w:type="spellStart"/>
-            <w:r>
-              <w:rPr>
-                <w:rFonts w:ascii="Times New Roman" w:eastAsia="Times New Roman" w:hAnsi="Times New Roman" w:cs="Times New Roman"/>
-                <w:b w:val="0"/>
-                <w:bCs w:val="0"/>
-              </w:rPr>
-              <w:t>stakeholder</w:t>
-            </w:r>
-            <w:proofErr w:type="spellEnd"/>
-            <w:r>
-              <w:rPr>
-                <w:rFonts w:ascii="Times New Roman" w:eastAsia="Times New Roman" w:hAnsi="Times New Roman" w:cs="Times New Roman"/>
-                <w:b w:val="0"/>
-                <w:bCs w:val="0"/>
-              </w:rPr>
-              <w:t>.</w:t>
+              <w:t>Revisión del Burndown Chart en cada Sprint.</w:t>
+            </w:r>
+          </w:p>
+          <w:p>
+            <w:r>
+              <w:rPr>
+                <w:rFonts w:ascii="Times New Roman" w:eastAsia="Times New Roman" w:hAnsi="Times New Roman" w:cs="Times New Roman"/>
+                <w:b w:val="0"/>
+                <w:bCs w:val="0"/>
+              </w:rPr>
+              <w:t>Validación semanal de avances con el tutor/stakeholder.</w:t>
             </w:r>
           </w:p>
           <w:p>
@@ -9013,43 +8321,7 @@
                 <w:b w:val="0"/>
                 <w:bCs w:val="0"/>
               </w:rPr>
-              <w:t xml:space="preserve">Jose Francisco Quezada </w:t>
-            </w:r>
-            <w:proofErr w:type="spellStart"/>
-            <w:r>
-              <w:rPr>
-                <w:rFonts w:ascii="Times New Roman" w:eastAsia="Times New Roman" w:hAnsi="Times New Roman" w:cs="Times New Roman"/>
-                <w:b w:val="0"/>
-                <w:bCs w:val="0"/>
-              </w:rPr>
-              <w:t>Quezada</w:t>
-            </w:r>
-            <w:proofErr w:type="spellEnd"/>
-            <w:r>
-              <w:rPr>
-                <w:rFonts w:ascii="Times New Roman" w:eastAsia="Times New Roman" w:hAnsi="Times New Roman" w:cs="Times New Roman"/>
-                <w:b w:val="0"/>
-                <w:bCs w:val="0"/>
-              </w:rPr>
-              <w:t xml:space="preserve"> (</w:t>
-            </w:r>
-            <w:proofErr w:type="spellStart"/>
-            <w:r>
-              <w:rPr>
-                <w:rFonts w:ascii="Times New Roman" w:eastAsia="Times New Roman" w:hAnsi="Times New Roman" w:cs="Times New Roman"/>
-                <w:b w:val="0"/>
-                <w:bCs w:val="0"/>
-              </w:rPr>
-              <w:t>Product</w:t>
-            </w:r>
-            <w:proofErr w:type="spellEnd"/>
-            <w:r>
-              <w:rPr>
-                <w:rFonts w:ascii="Times New Roman" w:eastAsia="Times New Roman" w:hAnsi="Times New Roman" w:cs="Times New Roman"/>
-                <w:b w:val="0"/>
-                <w:bCs w:val="0"/>
-              </w:rPr>
-              <w:t xml:space="preserve"> Owner)</w:t>
+              <w:t>Jose Francisco Quezada Quezada (Product Owner)</w:t>
             </w:r>
           </w:p>
         </w:tc>
@@ -9366,43 +8638,7 @@
                 <w:b w:val="0"/>
                 <w:bCs w:val="0"/>
               </w:rPr>
-              <w:t xml:space="preserve">Especialización técnica (uno solo sabe </w:t>
-            </w:r>
-            <w:proofErr w:type="spellStart"/>
-            <w:r>
-              <w:rPr>
-                <w:rFonts w:ascii="Times New Roman" w:eastAsia="Times New Roman" w:hAnsi="Times New Roman" w:cs="Times New Roman"/>
-                <w:b w:val="0"/>
-                <w:bCs w:val="0"/>
-              </w:rPr>
-              <w:t>Backend</w:t>
-            </w:r>
-            <w:proofErr w:type="spellEnd"/>
-            <w:r>
-              <w:rPr>
-                <w:rFonts w:ascii="Times New Roman" w:eastAsia="Times New Roman" w:hAnsi="Times New Roman" w:cs="Times New Roman"/>
-                <w:b w:val="0"/>
-                <w:bCs w:val="0"/>
-              </w:rPr>
-              <w:t xml:space="preserve">, otro solo </w:t>
-            </w:r>
-            <w:proofErr w:type="spellStart"/>
-            <w:r>
-              <w:rPr>
-                <w:rFonts w:ascii="Times New Roman" w:eastAsia="Times New Roman" w:hAnsi="Times New Roman" w:cs="Times New Roman"/>
-                <w:b w:val="0"/>
-                <w:bCs w:val="0"/>
-              </w:rPr>
-              <w:t>Frontend</w:t>
-            </w:r>
-            <w:proofErr w:type="spellEnd"/>
-            <w:r>
-              <w:rPr>
-                <w:rFonts w:ascii="Times New Roman" w:eastAsia="Times New Roman" w:hAnsi="Times New Roman" w:cs="Times New Roman"/>
-                <w:b w:val="0"/>
-                <w:bCs w:val="0"/>
-              </w:rPr>
-              <w:t>).</w:t>
+              <w:t>Especialización técnica (uno solo sabe Backend, otro solo Frontend).</w:t>
             </w:r>
           </w:p>
           <w:p>
@@ -9498,25 +8734,7 @@
                 <w:b w:val="0"/>
                 <w:bCs w:val="0"/>
               </w:rPr>
-              <w:t xml:space="preserve">Programación en Pareja (Pair </w:t>
-            </w:r>
-            <w:proofErr w:type="spellStart"/>
-            <w:r>
-              <w:rPr>
-                <w:rFonts w:ascii="Times New Roman" w:eastAsia="Times New Roman" w:hAnsi="Times New Roman" w:cs="Times New Roman"/>
-                <w:b w:val="0"/>
-                <w:bCs w:val="0"/>
-              </w:rPr>
-              <w:t>Programming</w:t>
-            </w:r>
-            <w:proofErr w:type="spellEnd"/>
-            <w:r>
-              <w:rPr>
-                <w:rFonts w:ascii="Times New Roman" w:eastAsia="Times New Roman" w:hAnsi="Times New Roman" w:cs="Times New Roman"/>
-                <w:b w:val="0"/>
-                <w:bCs w:val="0"/>
-              </w:rPr>
-              <w:t>) en módulos críticos.</w:t>
+              <w:t>Programación en Pareja (Pair Programming) en módulos críticos.</w:t>
             </w:r>
           </w:p>
           <w:p>
@@ -9580,53 +8798,17 @@
                 <w:b w:val="0"/>
                 <w:bCs w:val="0"/>
               </w:rPr>
-              <w:t xml:space="preserve">Daily </w:t>
-            </w:r>
-            <w:proofErr w:type="spellStart"/>
-            <w:r>
-              <w:rPr>
-                <w:rFonts w:ascii="Times New Roman" w:eastAsia="Times New Roman" w:hAnsi="Times New Roman" w:cs="Times New Roman"/>
-                <w:b w:val="0"/>
-                <w:bCs w:val="0"/>
-              </w:rPr>
-              <w:t>Standups</w:t>
-            </w:r>
-            <w:proofErr w:type="spellEnd"/>
-            <w:r>
-              <w:rPr>
-                <w:rFonts w:ascii="Times New Roman" w:eastAsia="Times New Roman" w:hAnsi="Times New Roman" w:cs="Times New Roman"/>
-                <w:b w:val="0"/>
-                <w:bCs w:val="0"/>
-              </w:rPr>
-              <w:t xml:space="preserve"> (reuniones rápidas diarias) para compartir contexto.</w:t>
-            </w:r>
-          </w:p>
-          <w:p>
-            <w:r>
-              <w:rPr>
-                <w:rFonts w:ascii="Times New Roman" w:eastAsia="Times New Roman" w:hAnsi="Times New Roman" w:cs="Times New Roman"/>
-                <w:b w:val="0"/>
-                <w:bCs w:val="0"/>
-              </w:rPr>
-              <w:t xml:space="preserve">Revisión de código cruzada (Pull </w:t>
-            </w:r>
-            <w:proofErr w:type="spellStart"/>
-            <w:r>
-              <w:rPr>
-                <w:rFonts w:ascii="Times New Roman" w:eastAsia="Times New Roman" w:hAnsi="Times New Roman" w:cs="Times New Roman"/>
-                <w:b w:val="0"/>
-                <w:bCs w:val="0"/>
-              </w:rPr>
-              <w:t>Requests</w:t>
-            </w:r>
-            <w:proofErr w:type="spellEnd"/>
-            <w:r>
-              <w:rPr>
-                <w:rFonts w:ascii="Times New Roman" w:eastAsia="Times New Roman" w:hAnsi="Times New Roman" w:cs="Times New Roman"/>
-                <w:b w:val="0"/>
-                <w:bCs w:val="0"/>
-              </w:rPr>
-              <w:t>).</w:t>
+              <w:t>Daily Standups (reuniones rápidas diarias) para compartir contexto.</w:t>
+            </w:r>
+          </w:p>
+          <w:p>
+            <w:r>
+              <w:rPr>
+                <w:rFonts w:ascii="Times New Roman" w:eastAsia="Times New Roman" w:hAnsi="Times New Roman" w:cs="Times New Roman"/>
+                <w:b w:val="0"/>
+                <w:bCs w:val="0"/>
+              </w:rPr>
+              <w:t>Revisión de código cruzada (Pull Requests).</w:t>
             </w:r>
           </w:p>
           <w:p>
@@ -10469,17 +9651,8 @@
                 <w:rFonts w:ascii="Times New Roman" w:eastAsia="Times New Roman" w:hAnsi="Times New Roman" w:cs="Times New Roman"/>
                 <w:lang w:val="es-EC"/>
               </w:rPr>
-              <w:t xml:space="preserve">Jose Francisco Quezada </w:t>
-            </w:r>
-            <w:proofErr w:type="spellStart"/>
-            <w:r>
-              <w:rPr>
-                <w:rFonts w:ascii="Times New Roman" w:eastAsia="Times New Roman" w:hAnsi="Times New Roman" w:cs="Times New Roman"/>
-                <w:lang w:val="es-EC"/>
-              </w:rPr>
-              <w:t>Quezada</w:t>
-            </w:r>
-            <w:proofErr w:type="spellEnd"/>
+              <w:t>Jose Francisco Quezada Quezada</w:t>
+            </w:r>
           </w:p>
         </w:tc>
       </w:tr>
@@ -10821,39 +9994,7 @@
                 <w:rFonts w:ascii="Times New Roman" w:eastAsia="Times New Roman" w:hAnsi="Times New Roman" w:cs="Times New Roman"/>
                 <w:lang w:val="es-EC"/>
               </w:rPr>
-              <w:t xml:space="preserve">Crear modelo de base de datos </w:t>
-            </w:r>
-            <w:proofErr w:type="spellStart"/>
-            <w:r>
-              <w:rPr>
-                <w:rFonts w:ascii="Times New Roman" w:eastAsia="Times New Roman" w:hAnsi="Times New Roman" w:cs="Times New Roman"/>
-                <w:lang w:val="es-EC"/>
-              </w:rPr>
-              <w:t>Booking</w:t>
-            </w:r>
-            <w:proofErr w:type="spellEnd"/>
-            <w:r>
-              <w:rPr>
-                <w:rFonts w:ascii="Times New Roman" w:eastAsia="Times New Roman" w:hAnsi="Times New Roman" w:cs="Times New Roman"/>
-                <w:lang w:val="es-EC"/>
-              </w:rPr>
-              <w:t xml:space="preserve"> y relaciones con </w:t>
-            </w:r>
-            <w:proofErr w:type="spellStart"/>
-            <w:r>
-              <w:rPr>
-                <w:rFonts w:ascii="Times New Roman" w:eastAsia="Times New Roman" w:hAnsi="Times New Roman" w:cs="Times New Roman"/>
-                <w:lang w:val="es-EC"/>
-              </w:rPr>
-              <w:t>TourInstance</w:t>
-            </w:r>
-            <w:proofErr w:type="spellEnd"/>
-            <w:r>
-              <w:rPr>
-                <w:rFonts w:ascii="Times New Roman" w:eastAsia="Times New Roman" w:hAnsi="Times New Roman" w:cs="Times New Roman"/>
-                <w:lang w:val="es-EC"/>
-              </w:rPr>
-              <w:t>.</w:t>
+              <w:t>Crear modelo de base de datos Booking y relaciones con TourInstance.</w:t>
             </w:r>
           </w:p>
         </w:tc>
@@ -10908,55 +10049,7 @@
                 <w:rFonts w:ascii="Times New Roman" w:eastAsia="Times New Roman" w:hAnsi="Times New Roman" w:cs="Times New Roman"/>
                 <w:lang w:val="es-EC"/>
               </w:rPr>
-              <w:t xml:space="preserve">Implementar </w:t>
-            </w:r>
-            <w:proofErr w:type="spellStart"/>
-            <w:r>
-              <w:rPr>
-                <w:rFonts w:ascii="Times New Roman" w:eastAsia="Times New Roman" w:hAnsi="Times New Roman" w:cs="Times New Roman"/>
-                <w:lang w:val="es-EC"/>
-              </w:rPr>
-              <w:t>Endpoint</w:t>
-            </w:r>
-            <w:proofErr w:type="spellEnd"/>
-            <w:r>
-              <w:rPr>
-                <w:rFonts w:ascii="Times New Roman" w:eastAsia="Times New Roman" w:hAnsi="Times New Roman" w:cs="Times New Roman"/>
-                <w:lang w:val="es-EC"/>
-              </w:rPr>
-              <w:t xml:space="preserve"> POST /</w:t>
-            </w:r>
-            <w:proofErr w:type="spellStart"/>
-            <w:r>
-              <w:rPr>
-                <w:rFonts w:ascii="Times New Roman" w:eastAsia="Times New Roman" w:hAnsi="Times New Roman" w:cs="Times New Roman"/>
-                <w:lang w:val="es-EC"/>
-              </w:rPr>
-              <w:t>bookings</w:t>
-            </w:r>
-            <w:proofErr w:type="spellEnd"/>
-            <w:r>
-              <w:rPr>
-                <w:rFonts w:ascii="Times New Roman" w:eastAsia="Times New Roman" w:hAnsi="Times New Roman" w:cs="Times New Roman"/>
-                <w:lang w:val="es-EC"/>
-              </w:rPr>
-              <w:t xml:space="preserve"> con transacción ACID (Prisma.$</w:t>
-            </w:r>
-            <w:proofErr w:type="spellStart"/>
-            <w:r>
-              <w:rPr>
-                <w:rFonts w:ascii="Times New Roman" w:eastAsia="Times New Roman" w:hAnsi="Times New Roman" w:cs="Times New Roman"/>
-                <w:lang w:val="es-EC"/>
-              </w:rPr>
-              <w:t>transaction</w:t>
-            </w:r>
-            <w:proofErr w:type="spellEnd"/>
-            <w:r>
-              <w:rPr>
-                <w:rFonts w:ascii="Times New Roman" w:eastAsia="Times New Roman" w:hAnsi="Times New Roman" w:cs="Times New Roman"/>
-                <w:lang w:val="es-EC"/>
-              </w:rPr>
-              <w:t>).</w:t>
+              <w:t>Implementar Endpoint POST /bookings con transacción ACID (Prisma.$transaction).</w:t>
             </w:r>
           </w:p>
         </w:tc>
@@ -11011,23 +10104,7 @@
                 <w:rFonts w:ascii="Times New Roman" w:eastAsia="Times New Roman" w:hAnsi="Times New Roman" w:cs="Times New Roman"/>
                 <w:lang w:val="es-EC"/>
               </w:rPr>
-              <w:t xml:space="preserve">Diseñar pantalla de </w:t>
-            </w:r>
-            <w:proofErr w:type="spellStart"/>
-            <w:r>
-              <w:rPr>
-                <w:rFonts w:ascii="Times New Roman" w:eastAsia="Times New Roman" w:hAnsi="Times New Roman" w:cs="Times New Roman"/>
-                <w:lang w:val="es-EC"/>
-              </w:rPr>
-              <w:t>checkout</w:t>
-            </w:r>
-            <w:proofErr w:type="spellEnd"/>
-            <w:r>
-              <w:rPr>
-                <w:rFonts w:ascii="Times New Roman" w:eastAsia="Times New Roman" w:hAnsi="Times New Roman" w:cs="Times New Roman"/>
-                <w:lang w:val="es-EC"/>
-              </w:rPr>
-              <w:t xml:space="preserve"> y resumen de compra en la PWA.</w:t>
+              <w:t>Diseñar pantalla de checkout y resumen de compra en la PWA.</w:t>
             </w:r>
           </w:p>
         </w:tc>
@@ -11694,17 +10771,8 @@
                 <w:rFonts w:ascii="Times New Roman" w:eastAsia="Times New Roman" w:hAnsi="Times New Roman" w:cs="Times New Roman"/>
                 <w:lang w:val="es-EC"/>
               </w:rPr>
-              <w:t xml:space="preserve">Jose Francisco Quezada </w:t>
-            </w:r>
-            <w:proofErr w:type="spellStart"/>
-            <w:r>
-              <w:rPr>
-                <w:rFonts w:ascii="Times New Roman" w:eastAsia="Times New Roman" w:hAnsi="Times New Roman" w:cs="Times New Roman"/>
-                <w:lang w:val="es-EC"/>
-              </w:rPr>
-              <w:t>Quezada</w:t>
-            </w:r>
-            <w:proofErr w:type="spellEnd"/>
+              <w:t>Jose Francisco Quezada Quezada</w:t>
+            </w:r>
           </w:p>
         </w:tc>
       </w:tr>
@@ -11951,23 +11019,7 @@
                 <w:rFonts w:ascii="Times New Roman" w:eastAsia="Times New Roman" w:hAnsi="Times New Roman" w:cs="Times New Roman"/>
                 <w:lang w:val="es-EC"/>
               </w:rPr>
-              <w:t xml:space="preserve">Agregar campo </w:t>
-            </w:r>
-            <w:proofErr w:type="spellStart"/>
-            <w:r>
-              <w:rPr>
-                <w:rFonts w:ascii="Times New Roman" w:eastAsia="Times New Roman" w:hAnsi="Times New Roman" w:cs="Times New Roman"/>
-                <w:lang w:val="es-EC"/>
-              </w:rPr>
-              <w:t>moodTags</w:t>
-            </w:r>
-            <w:proofErr w:type="spellEnd"/>
-            <w:r>
-              <w:rPr>
-                <w:rFonts w:ascii="Times New Roman" w:eastAsia="Times New Roman" w:hAnsi="Times New Roman" w:cs="Times New Roman"/>
-                <w:lang w:val="es-EC"/>
-              </w:rPr>
-              <w:t xml:space="preserve"> (Array) en la tabla Tour y crear índices de búsqueda.</w:t>
+              <w:t>Agregar campo moodTags (Array) en la tabla Tour y crear índices de búsqueda.</w:t>
             </w:r>
           </w:p>
         </w:tc>
@@ -12022,55 +11074,7 @@
                 <w:rFonts w:ascii="Times New Roman" w:eastAsia="Times New Roman" w:hAnsi="Times New Roman" w:cs="Times New Roman"/>
                 <w:lang w:val="es-EC"/>
               </w:rPr>
-              <w:t xml:space="preserve">Implementar lógica de filtrado en </w:t>
-            </w:r>
-            <w:proofErr w:type="spellStart"/>
-            <w:r>
-              <w:rPr>
-                <w:rFonts w:ascii="Times New Roman" w:eastAsia="Times New Roman" w:hAnsi="Times New Roman" w:cs="Times New Roman"/>
-                <w:lang w:val="es-EC"/>
-              </w:rPr>
-              <w:t>Endpoint</w:t>
-            </w:r>
-            <w:proofErr w:type="spellEnd"/>
-            <w:r>
-              <w:rPr>
-                <w:rFonts w:ascii="Times New Roman" w:eastAsia="Times New Roman" w:hAnsi="Times New Roman" w:cs="Times New Roman"/>
-                <w:lang w:val="es-EC"/>
-              </w:rPr>
-              <w:t xml:space="preserve"> GET /tours recibiendo </w:t>
-            </w:r>
-            <w:proofErr w:type="spellStart"/>
-            <w:r>
-              <w:rPr>
-                <w:rFonts w:ascii="Times New Roman" w:eastAsia="Times New Roman" w:hAnsi="Times New Roman" w:cs="Times New Roman"/>
-                <w:lang w:val="es-EC"/>
-              </w:rPr>
-              <w:t>query</w:t>
-            </w:r>
-            <w:proofErr w:type="spellEnd"/>
-            <w:r>
-              <w:rPr>
-                <w:rFonts w:ascii="Times New Roman" w:eastAsia="Times New Roman" w:hAnsi="Times New Roman" w:cs="Times New Roman"/>
-                <w:lang w:val="es-EC"/>
-              </w:rPr>
-              <w:t xml:space="preserve"> </w:t>
-            </w:r>
-            <w:proofErr w:type="spellStart"/>
-            <w:r>
-              <w:rPr>
-                <w:rFonts w:ascii="Times New Roman" w:eastAsia="Times New Roman" w:hAnsi="Times New Roman" w:cs="Times New Roman"/>
-                <w:lang w:val="es-EC"/>
-              </w:rPr>
-              <w:t>params</w:t>
-            </w:r>
-            <w:proofErr w:type="spellEnd"/>
-            <w:r>
-              <w:rPr>
-                <w:rFonts w:ascii="Times New Roman" w:eastAsia="Times New Roman" w:hAnsi="Times New Roman" w:cs="Times New Roman"/>
-                <w:lang w:val="es-EC"/>
-              </w:rPr>
-              <w:t>.</w:t>
+              <w:t>Implementar lógica de filtrado en Endpoint GET /tours recibiendo query params.</w:t>
             </w:r>
           </w:p>
         </w:tc>
@@ -12125,23 +11129,7 @@
                 <w:rFonts w:ascii="Times New Roman" w:eastAsia="Times New Roman" w:hAnsi="Times New Roman" w:cs="Times New Roman"/>
                 <w:lang w:val="es-EC"/>
               </w:rPr>
-              <w:t xml:space="preserve">Crear componente visual de "Chips" o botones de selección de categorías en </w:t>
-            </w:r>
-            <w:proofErr w:type="spellStart"/>
-            <w:r>
-              <w:rPr>
-                <w:rFonts w:ascii="Times New Roman" w:eastAsia="Times New Roman" w:hAnsi="Times New Roman" w:cs="Times New Roman"/>
-                <w:lang w:val="es-EC"/>
-              </w:rPr>
-              <w:t>Frontend</w:t>
-            </w:r>
-            <w:proofErr w:type="spellEnd"/>
-            <w:r>
-              <w:rPr>
-                <w:rFonts w:ascii="Times New Roman" w:eastAsia="Times New Roman" w:hAnsi="Times New Roman" w:cs="Times New Roman"/>
-                <w:lang w:val="es-EC"/>
-              </w:rPr>
-              <w:t>.</w:t>
+              <w:t>Crear componente visual de "Chips" o botones de selección de categorías en Frontend.</w:t>
             </w:r>
           </w:p>
         </w:tc>
@@ -12794,17 +11782,8 @@
                 <w:rFonts w:ascii="Times New Roman" w:eastAsia="Times New Roman" w:hAnsi="Times New Roman" w:cs="Times New Roman"/>
                 <w:lang w:val="es-EC"/>
               </w:rPr>
-              <w:t xml:space="preserve">Jose Francisco Quezada </w:t>
-            </w:r>
-            <w:proofErr w:type="spellStart"/>
-            <w:r>
-              <w:rPr>
-                <w:rFonts w:ascii="Times New Roman" w:eastAsia="Times New Roman" w:hAnsi="Times New Roman" w:cs="Times New Roman"/>
-                <w:lang w:val="es-EC"/>
-              </w:rPr>
-              <w:t>Quezada</w:t>
-            </w:r>
-            <w:proofErr w:type="spellEnd"/>
+              <w:t>Jose Francisco Quezada Quezada</w:t>
+            </w:r>
           </w:p>
         </w:tc>
       </w:tr>
@@ -13053,39 +12032,7 @@
                 <w:rFonts w:ascii="Times New Roman" w:eastAsia="Times New Roman" w:hAnsi="Times New Roman" w:cs="Times New Roman"/>
                 <w:lang w:val="es-EC"/>
               </w:rPr>
-              <w:t xml:space="preserve">Crear </w:t>
-            </w:r>
-            <w:proofErr w:type="spellStart"/>
-            <w:r>
-              <w:rPr>
-                <w:rFonts w:ascii="Times New Roman" w:eastAsia="Times New Roman" w:hAnsi="Times New Roman" w:cs="Times New Roman"/>
-                <w:lang w:val="es-EC"/>
-              </w:rPr>
-              <w:t>Endpoint</w:t>
-            </w:r>
-            <w:proofErr w:type="spellEnd"/>
-            <w:r>
-              <w:rPr>
-                <w:rFonts w:ascii="Times New Roman" w:eastAsia="Times New Roman" w:hAnsi="Times New Roman" w:cs="Times New Roman"/>
-                <w:lang w:val="es-EC"/>
-              </w:rPr>
-              <w:t xml:space="preserve"> PATCH /tours/:id/</w:t>
-            </w:r>
-            <w:proofErr w:type="spellStart"/>
-            <w:r>
-              <w:rPr>
-                <w:rFonts w:ascii="Times New Roman" w:eastAsia="Times New Roman" w:hAnsi="Times New Roman" w:cs="Times New Roman"/>
-                <w:lang w:val="es-EC"/>
-              </w:rPr>
-              <w:t>availability</w:t>
-            </w:r>
-            <w:proofErr w:type="spellEnd"/>
-            <w:r>
-              <w:rPr>
-                <w:rFonts w:ascii="Times New Roman" w:eastAsia="Times New Roman" w:hAnsi="Times New Roman" w:cs="Times New Roman"/>
-                <w:lang w:val="es-EC"/>
-              </w:rPr>
-              <w:t xml:space="preserve"> para modificar estados de fechas.</w:t>
+              <w:t>Crear Endpoint PATCH /tours/:id/availability para modificar estados de fechas.</w:t>
             </w:r>
           </w:p>
         </w:tc>
@@ -13140,39 +12087,7 @@
                 <w:rFonts w:ascii="Times New Roman" w:eastAsia="Times New Roman" w:hAnsi="Times New Roman" w:cs="Times New Roman"/>
                 <w:lang w:val="es-EC"/>
               </w:rPr>
-              <w:t xml:space="preserve">Integrar librería de calendario (ej. </w:t>
-            </w:r>
-            <w:proofErr w:type="spellStart"/>
-            <w:r>
-              <w:rPr>
-                <w:rFonts w:ascii="Times New Roman" w:eastAsia="Times New Roman" w:hAnsi="Times New Roman" w:cs="Times New Roman"/>
-                <w:lang w:val="es-EC"/>
-              </w:rPr>
-              <w:t>react</w:t>
-            </w:r>
-            <w:proofErr w:type="spellEnd"/>
-            <w:r>
-              <w:rPr>
-                <w:rFonts w:ascii="Times New Roman" w:eastAsia="Times New Roman" w:hAnsi="Times New Roman" w:cs="Times New Roman"/>
-                <w:lang w:val="es-EC"/>
-              </w:rPr>
-              <w:t xml:space="preserve">-calendar) en el </w:t>
-            </w:r>
-            <w:proofErr w:type="spellStart"/>
-            <w:r>
-              <w:rPr>
-                <w:rFonts w:ascii="Times New Roman" w:eastAsia="Times New Roman" w:hAnsi="Times New Roman" w:cs="Times New Roman"/>
-                <w:lang w:val="es-EC"/>
-              </w:rPr>
-              <w:t>Dashboard</w:t>
-            </w:r>
-            <w:proofErr w:type="spellEnd"/>
-            <w:r>
-              <w:rPr>
-                <w:rFonts w:ascii="Times New Roman" w:eastAsia="Times New Roman" w:hAnsi="Times New Roman" w:cs="Times New Roman"/>
-                <w:lang w:val="es-EC"/>
-              </w:rPr>
-              <w:t xml:space="preserve"> del Guía.</w:t>
+              <w:t>Integrar librería de calendario (ej. react-calendar) en el Dashboard del Guía.</w:t>
             </w:r>
           </w:p>
         </w:tc>
@@ -13837,23 +12752,7 @@
                 <w:rFonts w:ascii="Times New Roman" w:eastAsia="Times New Roman" w:hAnsi="Times New Roman" w:cs="Times New Roman"/>
                 <w:lang w:val="es-EC"/>
               </w:rPr>
-              <w:t xml:space="preserve">Validar generación correcta del Token JWT al </w:t>
-            </w:r>
-            <w:proofErr w:type="spellStart"/>
-            <w:r>
-              <w:rPr>
-                <w:rFonts w:ascii="Times New Roman" w:eastAsia="Times New Roman" w:hAnsi="Times New Roman" w:cs="Times New Roman"/>
-                <w:lang w:val="es-EC"/>
-              </w:rPr>
-              <w:t>loguearse</w:t>
-            </w:r>
-            <w:proofErr w:type="spellEnd"/>
-            <w:r>
-              <w:rPr>
-                <w:rFonts w:ascii="Times New Roman" w:eastAsia="Times New Roman" w:hAnsi="Times New Roman" w:cs="Times New Roman"/>
-                <w:lang w:val="es-EC"/>
-              </w:rPr>
-              <w:t>.</w:t>
+              <w:t>Validar generación correcta del Token JWT al loguearse.</w:t>
             </w:r>
           </w:p>
         </w:tc>
@@ -13949,39 +12848,7 @@
                 <w:rFonts w:ascii="Times New Roman" w:eastAsia="Times New Roman" w:hAnsi="Times New Roman" w:cs="Times New Roman"/>
                 <w:lang w:val="es-EC"/>
               </w:rPr>
-              <w:t>Verificar que el usuario no pueda acceder a rutas privadas /</w:t>
-            </w:r>
-            <w:proofErr w:type="spellStart"/>
-            <w:r>
-              <w:rPr>
-                <w:rFonts w:ascii="Times New Roman" w:eastAsia="Times New Roman" w:hAnsi="Times New Roman" w:cs="Times New Roman"/>
-                <w:lang w:val="es-EC"/>
-              </w:rPr>
-              <w:t>profile</w:t>
-            </w:r>
-            <w:proofErr w:type="spellEnd"/>
-            <w:r>
-              <w:rPr>
-                <w:rFonts w:ascii="Times New Roman" w:eastAsia="Times New Roman" w:hAnsi="Times New Roman" w:cs="Times New Roman"/>
-                <w:lang w:val="es-EC"/>
-              </w:rPr>
-              <w:t xml:space="preserve"> sin estar </w:t>
-            </w:r>
-            <w:proofErr w:type="spellStart"/>
-            <w:r>
-              <w:rPr>
-                <w:rFonts w:ascii="Times New Roman" w:eastAsia="Times New Roman" w:hAnsi="Times New Roman" w:cs="Times New Roman"/>
-                <w:lang w:val="es-EC"/>
-              </w:rPr>
-              <w:t>logueado</w:t>
-            </w:r>
-            <w:proofErr w:type="spellEnd"/>
-            <w:r>
-              <w:rPr>
-                <w:rFonts w:ascii="Times New Roman" w:eastAsia="Times New Roman" w:hAnsi="Times New Roman" w:cs="Times New Roman"/>
-                <w:lang w:val="es-EC"/>
-              </w:rPr>
-              <w:t>.</w:t>
+              <w:t>Verificar que el usuario no pueda acceder a rutas privadas /profile sin estar logueado.</w:t>
             </w:r>
           </w:p>
         </w:tc>
@@ -14023,17 +12890,8 @@
                 <w:rFonts w:ascii="Times New Roman" w:eastAsia="Times New Roman" w:hAnsi="Times New Roman" w:cs="Times New Roman"/>
                 <w:lang w:val="es-EC"/>
               </w:rPr>
-              <w:t xml:space="preserve">Jose Francisco Quezada </w:t>
-            </w:r>
-            <w:proofErr w:type="spellStart"/>
-            <w:r>
-              <w:rPr>
-                <w:rFonts w:ascii="Times New Roman" w:eastAsia="Times New Roman" w:hAnsi="Times New Roman" w:cs="Times New Roman"/>
-                <w:lang w:val="es-EC"/>
-              </w:rPr>
-              <w:t>Quezada</w:t>
-            </w:r>
-            <w:proofErr w:type="spellEnd"/>
+              <w:t>Jose Francisco Quezada Quezada</w:t>
+            </w:r>
           </w:p>
         </w:tc>
       </w:tr>
@@ -14179,23 +13037,7 @@
                 <w:rFonts w:ascii="Times New Roman" w:eastAsia="Times New Roman" w:hAnsi="Times New Roman" w:cs="Times New Roman"/>
                 <w:lang w:val="es-EC"/>
               </w:rPr>
-              <w:t xml:space="preserve">Configurar Passport.js o </w:t>
-            </w:r>
-            <w:proofErr w:type="spellStart"/>
-            <w:r>
-              <w:rPr>
-                <w:rFonts w:ascii="Times New Roman" w:eastAsia="Times New Roman" w:hAnsi="Times New Roman" w:cs="Times New Roman"/>
-                <w:lang w:val="es-EC"/>
-              </w:rPr>
-              <w:t>NestJS</w:t>
-            </w:r>
-            <w:proofErr w:type="spellEnd"/>
-            <w:r>
-              <w:rPr>
-                <w:rFonts w:ascii="Times New Roman" w:eastAsia="Times New Roman" w:hAnsi="Times New Roman" w:cs="Times New Roman"/>
-                <w:lang w:val="es-EC"/>
-              </w:rPr>
-              <w:t xml:space="preserve"> Auth Guard con estrategia JWT.</w:t>
+              <w:t>Configurar Passport.js o NestJS Auth Guard con estrategia JWT.</w:t>
             </w:r>
           </w:p>
         </w:tc>
@@ -14248,39 +13090,7 @@
                 <w:rFonts w:ascii="Times New Roman" w:eastAsia="Times New Roman" w:hAnsi="Times New Roman" w:cs="Times New Roman"/>
                 <w:lang w:val="es-EC"/>
               </w:rPr>
-              <w:t>Crear pantallas de Login/Register con validación de formularios (</w:t>
-            </w:r>
-            <w:proofErr w:type="spellStart"/>
-            <w:r>
-              <w:rPr>
-                <w:rFonts w:ascii="Times New Roman" w:eastAsia="Times New Roman" w:hAnsi="Times New Roman" w:cs="Times New Roman"/>
-                <w:lang w:val="es-EC"/>
-              </w:rPr>
-              <w:t>Formik</w:t>
-            </w:r>
-            <w:proofErr w:type="spellEnd"/>
-            <w:r>
-              <w:rPr>
-                <w:rFonts w:ascii="Times New Roman" w:eastAsia="Times New Roman" w:hAnsi="Times New Roman" w:cs="Times New Roman"/>
-                <w:lang w:val="es-EC"/>
-              </w:rPr>
-              <w:t>/</w:t>
-            </w:r>
-            <w:proofErr w:type="spellStart"/>
-            <w:r>
-              <w:rPr>
-                <w:rFonts w:ascii="Times New Roman" w:eastAsia="Times New Roman" w:hAnsi="Times New Roman" w:cs="Times New Roman"/>
-                <w:lang w:val="es-EC"/>
-              </w:rPr>
-              <w:t>Zod</w:t>
-            </w:r>
-            <w:proofErr w:type="spellEnd"/>
-            <w:r>
-              <w:rPr>
-                <w:rFonts w:ascii="Times New Roman" w:eastAsia="Times New Roman" w:hAnsi="Times New Roman" w:cs="Times New Roman"/>
-                <w:lang w:val="es-EC"/>
-              </w:rPr>
-              <w:t>).</w:t>
+              <w:t>Crear pantallas de Login/Register con validación de formularios (Formik/Zod).</w:t>
             </w:r>
           </w:p>
         </w:tc>
@@ -14933,17 +13743,8 @@
                 <w:rFonts w:ascii="Times New Roman" w:eastAsia="Times New Roman" w:hAnsi="Times New Roman" w:cs="Times New Roman"/>
                 <w:lang w:val="es-EC"/>
               </w:rPr>
-              <w:t xml:space="preserve">Jose Francisco Quezada </w:t>
-            </w:r>
-            <w:proofErr w:type="spellStart"/>
-            <w:r>
-              <w:rPr>
-                <w:rFonts w:ascii="Times New Roman" w:eastAsia="Times New Roman" w:hAnsi="Times New Roman" w:cs="Times New Roman"/>
-                <w:lang w:val="es-EC"/>
-              </w:rPr>
-              <w:t>Quezada</w:t>
-            </w:r>
-            <w:proofErr w:type="spellEnd"/>
+              <w:t>Jose Francisco Quezada Quezada</w:t>
+            </w:r>
           </w:p>
         </w:tc>
       </w:tr>
@@ -15191,39 +13992,7 @@
                 <w:rFonts w:ascii="Times New Roman" w:eastAsia="Times New Roman" w:hAnsi="Times New Roman" w:cs="Times New Roman"/>
                 <w:lang w:val="es-EC"/>
               </w:rPr>
-              <w:t xml:space="preserve">Configurar </w:t>
-            </w:r>
-            <w:proofErr w:type="spellStart"/>
-            <w:r>
-              <w:rPr>
-                <w:rFonts w:ascii="Times New Roman" w:eastAsia="Times New Roman" w:hAnsi="Times New Roman" w:cs="Times New Roman"/>
-                <w:lang w:val="es-EC"/>
-              </w:rPr>
-              <w:t>Workbox</w:t>
-            </w:r>
-            <w:proofErr w:type="spellEnd"/>
-            <w:r>
-              <w:rPr>
-                <w:rFonts w:ascii="Times New Roman" w:eastAsia="Times New Roman" w:hAnsi="Times New Roman" w:cs="Times New Roman"/>
-                <w:lang w:val="es-EC"/>
-              </w:rPr>
-              <w:t xml:space="preserve"> y Service </w:t>
-            </w:r>
-            <w:proofErr w:type="spellStart"/>
-            <w:r>
-              <w:rPr>
-                <w:rFonts w:ascii="Times New Roman" w:eastAsia="Times New Roman" w:hAnsi="Times New Roman" w:cs="Times New Roman"/>
-                <w:lang w:val="es-EC"/>
-              </w:rPr>
-              <w:t>Workers</w:t>
-            </w:r>
-            <w:proofErr w:type="spellEnd"/>
-            <w:r>
-              <w:rPr>
-                <w:rFonts w:ascii="Times New Roman" w:eastAsia="Times New Roman" w:hAnsi="Times New Roman" w:cs="Times New Roman"/>
-                <w:lang w:val="es-EC"/>
-              </w:rPr>
-              <w:t xml:space="preserve"> para estrategia "Cache First" en rutas de tickets.</w:t>
+              <w:t>Configurar Workbox y Service Workers para estrategia "Cache First" en rutas de tickets.</w:t>
             </w:r>
           </w:p>
         </w:tc>
@@ -15278,39 +14047,7 @@
                 <w:rFonts w:ascii="Times New Roman" w:eastAsia="Times New Roman" w:hAnsi="Times New Roman" w:cs="Times New Roman"/>
                 <w:lang w:val="es-EC"/>
               </w:rPr>
-              <w:t>Implementar almacenamiento local (</w:t>
-            </w:r>
-            <w:proofErr w:type="spellStart"/>
-            <w:r>
-              <w:rPr>
-                <w:rFonts w:ascii="Times New Roman" w:eastAsia="Times New Roman" w:hAnsi="Times New Roman" w:cs="Times New Roman"/>
-                <w:lang w:val="es-EC"/>
-              </w:rPr>
-              <w:t>IndexedDB</w:t>
-            </w:r>
-            <w:proofErr w:type="spellEnd"/>
-            <w:r>
-              <w:rPr>
-                <w:rFonts w:ascii="Times New Roman" w:eastAsia="Times New Roman" w:hAnsi="Times New Roman" w:cs="Times New Roman"/>
-                <w:lang w:val="es-EC"/>
-              </w:rPr>
-              <w:t xml:space="preserve">) para guardar el objeto </w:t>
-            </w:r>
-            <w:proofErr w:type="spellStart"/>
-            <w:r>
-              <w:rPr>
-                <w:rFonts w:ascii="Times New Roman" w:eastAsia="Times New Roman" w:hAnsi="Times New Roman" w:cs="Times New Roman"/>
-                <w:lang w:val="es-EC"/>
-              </w:rPr>
-              <w:t>Booking</w:t>
-            </w:r>
-            <w:proofErr w:type="spellEnd"/>
-            <w:r>
-              <w:rPr>
-                <w:rFonts w:ascii="Times New Roman" w:eastAsia="Times New Roman" w:hAnsi="Times New Roman" w:cs="Times New Roman"/>
-                <w:lang w:val="es-EC"/>
-              </w:rPr>
-              <w:t xml:space="preserve"> completo.</w:t>
+              <w:t>Implementar almacenamiento local (IndexedDB) para guardar el objeto Booking completo.</w:t>
             </w:r>
           </w:p>
         </w:tc>
@@ -15923,37 +14660,19 @@
               </w:rPr>
               <w:t xml:space="preserve">Verificar </w:t>
             </w:r>
-            <w:proofErr w:type="gramStart"/>
-            <w:r>
-              <w:rPr>
-                <w:rFonts w:ascii="Times New Roman" w:eastAsia="Times New Roman" w:hAnsi="Times New Roman" w:cs="Times New Roman"/>
-                <w:lang w:val="es-EC"/>
-              </w:rPr>
-              <w:t>que</w:t>
-            </w:r>
-            <w:proofErr w:type="gramEnd"/>
-            <w:r>
-              <w:rPr>
-                <w:rFonts w:ascii="Times New Roman" w:eastAsia="Times New Roman" w:hAnsi="Times New Roman" w:cs="Times New Roman"/>
-                <w:lang w:val="es-EC"/>
-              </w:rPr>
-              <w:t xml:space="preserve"> al entrar al chat, solo veo mensajes de mi grupo (Room </w:t>
-            </w:r>
-            <w:proofErr w:type="spellStart"/>
-            <w:r>
-              <w:rPr>
-                <w:rFonts w:ascii="Times New Roman" w:eastAsia="Times New Roman" w:hAnsi="Times New Roman" w:cs="Times New Roman"/>
-                <w:lang w:val="es-EC"/>
-              </w:rPr>
-              <w:t>Isolation</w:t>
-            </w:r>
-            <w:proofErr w:type="spellEnd"/>
-            <w:r>
-              <w:rPr>
-                <w:rFonts w:ascii="Times New Roman" w:eastAsia="Times New Roman" w:hAnsi="Times New Roman" w:cs="Times New Roman"/>
-                <w:lang w:val="es-EC"/>
-              </w:rPr>
-              <w:t>).</w:t>
+            <w:r>
+              <w:rPr>
+                <w:rFonts w:ascii="Times New Roman" w:eastAsia="Times New Roman" w:hAnsi="Times New Roman" w:cs="Times New Roman"/>
+                <w:lang w:val="es-EC"/>
+              </w:rPr>
+              <w:t>que,</w:t>
+            </w:r>
+            <w:r>
+              <w:rPr>
+                <w:rFonts w:ascii="Times New Roman" w:eastAsia="Times New Roman" w:hAnsi="Times New Roman" w:cs="Times New Roman"/>
+                <w:lang w:val="es-EC"/>
+              </w:rPr>
+              <w:t xml:space="preserve"> al entrar al chat, solo veo mensajes de mi grupo (Room Isolation).</w:t>
             </w:r>
           </w:p>
         </w:tc>
@@ -16091,17 +14810,8 @@
                 <w:rFonts w:ascii="Times New Roman" w:eastAsia="Times New Roman" w:hAnsi="Times New Roman" w:cs="Times New Roman"/>
                 <w:lang w:val="es-EC"/>
               </w:rPr>
-              <w:t xml:space="preserve">Jose Francisco Quezada </w:t>
-            </w:r>
-            <w:proofErr w:type="spellStart"/>
-            <w:r>
-              <w:rPr>
-                <w:rFonts w:ascii="Times New Roman" w:eastAsia="Times New Roman" w:hAnsi="Times New Roman" w:cs="Times New Roman"/>
-                <w:lang w:val="es-EC"/>
-              </w:rPr>
-              <w:t>Quezada</w:t>
-            </w:r>
-            <w:proofErr w:type="spellEnd"/>
+              <w:t>Jose Francisco Quezada Quezada</w:t>
+            </w:r>
           </w:p>
         </w:tc>
       </w:tr>
@@ -16247,39 +14957,7 @@
                 <w:rFonts w:ascii="Times New Roman" w:eastAsia="Times New Roman" w:hAnsi="Times New Roman" w:cs="Times New Roman"/>
                 <w:lang w:val="es-EC"/>
               </w:rPr>
-              <w:t xml:space="preserve">Implementar Gateway de Socket.IO con eventos </w:t>
-            </w:r>
-            <w:proofErr w:type="spellStart"/>
-            <w:r>
-              <w:rPr>
-                <w:rFonts w:ascii="Times New Roman" w:eastAsia="Times New Roman" w:hAnsi="Times New Roman" w:cs="Times New Roman"/>
-                <w:lang w:val="es-EC"/>
-              </w:rPr>
-              <w:t>join_room</w:t>
-            </w:r>
-            <w:proofErr w:type="spellEnd"/>
-            <w:r>
-              <w:rPr>
-                <w:rFonts w:ascii="Times New Roman" w:eastAsia="Times New Roman" w:hAnsi="Times New Roman" w:cs="Times New Roman"/>
-                <w:lang w:val="es-EC"/>
-              </w:rPr>
-              <w:t xml:space="preserve"> y </w:t>
-            </w:r>
-            <w:proofErr w:type="spellStart"/>
-            <w:r>
-              <w:rPr>
-                <w:rFonts w:ascii="Times New Roman" w:eastAsia="Times New Roman" w:hAnsi="Times New Roman" w:cs="Times New Roman"/>
-                <w:lang w:val="es-EC"/>
-              </w:rPr>
-              <w:t>send_message</w:t>
-            </w:r>
-            <w:proofErr w:type="spellEnd"/>
-            <w:r>
-              <w:rPr>
-                <w:rFonts w:ascii="Times New Roman" w:eastAsia="Times New Roman" w:hAnsi="Times New Roman" w:cs="Times New Roman"/>
-                <w:lang w:val="es-EC"/>
-              </w:rPr>
-              <w:t>.</w:t>
+              <w:t>Implementar Gateway de Socket.IO con eventos join_room y send_message.</w:t>
             </w:r>
           </w:p>
         </w:tc>
@@ -16332,23 +15010,7 @@
                 <w:rFonts w:ascii="Times New Roman" w:eastAsia="Times New Roman" w:hAnsi="Times New Roman" w:cs="Times New Roman"/>
                 <w:lang w:val="es-EC"/>
               </w:rPr>
-              <w:t xml:space="preserve">Crear interfaz de Chat (Burbujas de mensaje) en el </w:t>
-            </w:r>
-            <w:proofErr w:type="spellStart"/>
-            <w:r>
-              <w:rPr>
-                <w:rFonts w:ascii="Times New Roman" w:eastAsia="Times New Roman" w:hAnsi="Times New Roman" w:cs="Times New Roman"/>
-                <w:lang w:val="es-EC"/>
-              </w:rPr>
-              <w:t>Frontend</w:t>
-            </w:r>
-            <w:proofErr w:type="spellEnd"/>
-            <w:r>
-              <w:rPr>
-                <w:rFonts w:ascii="Times New Roman" w:eastAsia="Times New Roman" w:hAnsi="Times New Roman" w:cs="Times New Roman"/>
-                <w:lang w:val="es-EC"/>
-              </w:rPr>
-              <w:t>.</w:t>
+              <w:t>Crear interfaz de Chat (Burbujas de mensaje) en el Frontend.</w:t>
             </w:r>
           </w:p>
         </w:tc>
@@ -16559,37 +15221,19 @@
               </w:rPr>
               <w:t xml:space="preserve">Verificar </w:t>
             </w:r>
-            <w:proofErr w:type="gramStart"/>
-            <w:r>
-              <w:rPr>
-                <w:rFonts w:ascii="Times New Roman" w:eastAsia="Times New Roman" w:hAnsi="Times New Roman" w:cs="Times New Roman"/>
-                <w:lang w:val="es-EC"/>
-              </w:rPr>
-              <w:t>que</w:t>
-            </w:r>
-            <w:proofErr w:type="gramEnd"/>
-            <w:r>
-              <w:rPr>
-                <w:rFonts w:ascii="Times New Roman" w:eastAsia="Times New Roman" w:hAnsi="Times New Roman" w:cs="Times New Roman"/>
-                <w:lang w:val="es-EC"/>
-              </w:rPr>
-              <w:t xml:space="preserve"> al entrar al chat, solo veo mensajes de mi grupo (Room </w:t>
-            </w:r>
-            <w:proofErr w:type="spellStart"/>
-            <w:r>
-              <w:rPr>
-                <w:rFonts w:ascii="Times New Roman" w:eastAsia="Times New Roman" w:hAnsi="Times New Roman" w:cs="Times New Roman"/>
-                <w:lang w:val="es-EC"/>
-              </w:rPr>
-              <w:t>Isolation</w:t>
-            </w:r>
-            <w:proofErr w:type="spellEnd"/>
-            <w:r>
-              <w:rPr>
-                <w:rFonts w:ascii="Times New Roman" w:eastAsia="Times New Roman" w:hAnsi="Times New Roman" w:cs="Times New Roman"/>
-                <w:lang w:val="es-EC"/>
-              </w:rPr>
-              <w:t>).</w:t>
+            <w:r>
+              <w:rPr>
+                <w:rFonts w:ascii="Times New Roman" w:eastAsia="Times New Roman" w:hAnsi="Times New Roman" w:cs="Times New Roman"/>
+                <w:lang w:val="es-EC"/>
+              </w:rPr>
+              <w:t>que,</w:t>
+            </w:r>
+            <w:r>
+              <w:rPr>
+                <w:rFonts w:ascii="Times New Roman" w:eastAsia="Times New Roman" w:hAnsi="Times New Roman" w:cs="Times New Roman"/>
+                <w:lang w:val="es-EC"/>
+              </w:rPr>
+              <w:t xml:space="preserve"> al entrar al chat, solo veo mensajes de mi grupo (Room Isolation).</w:t>
             </w:r>
           </w:p>
         </w:tc>
@@ -16727,17 +15371,8 @@
                 <w:rFonts w:ascii="Times New Roman" w:eastAsia="Times New Roman" w:hAnsi="Times New Roman" w:cs="Times New Roman"/>
                 <w:lang w:val="es-EC"/>
               </w:rPr>
-              <w:t xml:space="preserve">Jose Francisco Quezada </w:t>
-            </w:r>
-            <w:proofErr w:type="spellStart"/>
-            <w:r>
-              <w:rPr>
-                <w:rFonts w:ascii="Times New Roman" w:eastAsia="Times New Roman" w:hAnsi="Times New Roman" w:cs="Times New Roman"/>
-                <w:lang w:val="es-EC"/>
-              </w:rPr>
-              <w:t>Quezada</w:t>
-            </w:r>
-            <w:proofErr w:type="spellEnd"/>
+              <w:t>Jose Francisco Quezada Quezada</w:t>
+            </w:r>
           </w:p>
         </w:tc>
       </w:tr>
@@ -16883,39 +15518,7 @@
                 <w:rFonts w:ascii="Times New Roman" w:eastAsia="Times New Roman" w:hAnsi="Times New Roman" w:cs="Times New Roman"/>
                 <w:lang w:val="es-EC"/>
               </w:rPr>
-              <w:t xml:space="preserve">Implementar Gateway de Socket.IO con eventos </w:t>
-            </w:r>
-            <w:proofErr w:type="spellStart"/>
-            <w:r>
-              <w:rPr>
-                <w:rFonts w:ascii="Times New Roman" w:eastAsia="Times New Roman" w:hAnsi="Times New Roman" w:cs="Times New Roman"/>
-                <w:lang w:val="es-EC"/>
-              </w:rPr>
-              <w:t>join_room</w:t>
-            </w:r>
-            <w:proofErr w:type="spellEnd"/>
-            <w:r>
-              <w:rPr>
-                <w:rFonts w:ascii="Times New Roman" w:eastAsia="Times New Roman" w:hAnsi="Times New Roman" w:cs="Times New Roman"/>
-                <w:lang w:val="es-EC"/>
-              </w:rPr>
-              <w:t xml:space="preserve"> y </w:t>
-            </w:r>
-            <w:proofErr w:type="spellStart"/>
-            <w:r>
-              <w:rPr>
-                <w:rFonts w:ascii="Times New Roman" w:eastAsia="Times New Roman" w:hAnsi="Times New Roman" w:cs="Times New Roman"/>
-                <w:lang w:val="es-EC"/>
-              </w:rPr>
-              <w:t>send_message</w:t>
-            </w:r>
-            <w:proofErr w:type="spellEnd"/>
-            <w:r>
-              <w:rPr>
-                <w:rFonts w:ascii="Times New Roman" w:eastAsia="Times New Roman" w:hAnsi="Times New Roman" w:cs="Times New Roman"/>
-                <w:lang w:val="es-EC"/>
-              </w:rPr>
-              <w:t>.</w:t>
+              <w:t>Implementar Gateway de Socket.IO con eventos join_room y send_message.</w:t>
             </w:r>
           </w:p>
         </w:tc>
@@ -16968,23 +15571,7 @@
                 <w:rFonts w:ascii="Times New Roman" w:eastAsia="Times New Roman" w:hAnsi="Times New Roman" w:cs="Times New Roman"/>
                 <w:lang w:val="es-EC"/>
               </w:rPr>
-              <w:t xml:space="preserve">Crear interfaz de Chat (Burbujas de mensaje) en el </w:t>
-            </w:r>
-            <w:proofErr w:type="spellStart"/>
-            <w:r>
-              <w:rPr>
-                <w:rFonts w:ascii="Times New Roman" w:eastAsia="Times New Roman" w:hAnsi="Times New Roman" w:cs="Times New Roman"/>
-                <w:lang w:val="es-EC"/>
-              </w:rPr>
-              <w:t>Frontend</w:t>
-            </w:r>
-            <w:proofErr w:type="spellEnd"/>
-            <w:r>
-              <w:rPr>
-                <w:rFonts w:ascii="Times New Roman" w:eastAsia="Times New Roman" w:hAnsi="Times New Roman" w:cs="Times New Roman"/>
-                <w:lang w:val="es-EC"/>
-              </w:rPr>
-              <w:t>.</w:t>
+              <w:t>Crear interfaz de Chat (Burbujas de mensaje) en el Frontend.</w:t>
             </w:r>
           </w:p>
         </w:tc>
@@ -17654,17 +16241,8 @@
                 <w:rFonts w:ascii="Times New Roman" w:eastAsia="Times New Roman" w:hAnsi="Times New Roman" w:cs="Times New Roman"/>
                 <w:lang w:val="es-EC"/>
               </w:rPr>
-              <w:t xml:space="preserve">Jose Francisco Quezada </w:t>
-            </w:r>
-            <w:proofErr w:type="spellStart"/>
-            <w:r>
-              <w:rPr>
-                <w:rFonts w:ascii="Times New Roman" w:eastAsia="Times New Roman" w:hAnsi="Times New Roman" w:cs="Times New Roman"/>
-                <w:lang w:val="es-EC"/>
-              </w:rPr>
-              <w:t>Quezada</w:t>
-            </w:r>
-            <w:proofErr w:type="spellEnd"/>
+              <w:t>Jose Francisco Quezada Quezada</w:t>
+            </w:r>
           </w:p>
         </w:tc>
       </w:tr>
@@ -17907,23 +16485,7 @@
                 <w:rFonts w:ascii="Times New Roman" w:eastAsia="Times New Roman" w:hAnsi="Times New Roman" w:cs="Times New Roman"/>
                 <w:lang w:val="es-EC"/>
               </w:rPr>
-              <w:t xml:space="preserve">Integrar librería de escaneo QR (ej. </w:t>
-            </w:r>
-            <w:proofErr w:type="spellStart"/>
-            <w:r>
-              <w:rPr>
-                <w:rFonts w:ascii="Times New Roman" w:eastAsia="Times New Roman" w:hAnsi="Times New Roman" w:cs="Times New Roman"/>
-                <w:lang w:val="es-EC"/>
-              </w:rPr>
-              <w:t>react-qr-reader</w:t>
-            </w:r>
-            <w:proofErr w:type="spellEnd"/>
-            <w:r>
-              <w:rPr>
-                <w:rFonts w:ascii="Times New Roman" w:eastAsia="Times New Roman" w:hAnsi="Times New Roman" w:cs="Times New Roman"/>
-                <w:lang w:val="es-EC"/>
-              </w:rPr>
-              <w:t>) en PWA.</w:t>
+              <w:t>Integrar librería de escaneo QR (ej. react-qr-reader) en PWA.</w:t>
             </w:r>
           </w:p>
         </w:tc>
@@ -17977,55 +16539,7 @@
                 <w:rFonts w:ascii="Times New Roman" w:eastAsia="Times New Roman" w:hAnsi="Times New Roman" w:cs="Times New Roman"/>
                 <w:lang w:val="en-US"/>
               </w:rPr>
-              <w:t xml:space="preserve">Endpoint POST /bookings/validate </w:t>
-            </w:r>
-            <w:proofErr w:type="spellStart"/>
-            <w:r>
-              <w:rPr>
-                <w:rFonts w:ascii="Times New Roman" w:eastAsia="Times New Roman" w:hAnsi="Times New Roman" w:cs="Times New Roman"/>
-                <w:lang w:val="en-US"/>
-              </w:rPr>
-              <w:t>que</w:t>
-            </w:r>
-            <w:proofErr w:type="spellEnd"/>
-            <w:r>
-              <w:rPr>
-                <w:rFonts w:ascii="Times New Roman" w:eastAsia="Times New Roman" w:hAnsi="Times New Roman" w:cs="Times New Roman"/>
-                <w:lang w:val="en-US"/>
-              </w:rPr>
-              <w:t xml:space="preserve"> </w:t>
-            </w:r>
-            <w:proofErr w:type="spellStart"/>
-            <w:r>
-              <w:rPr>
-                <w:rFonts w:ascii="Times New Roman" w:eastAsia="Times New Roman" w:hAnsi="Times New Roman" w:cs="Times New Roman"/>
-                <w:lang w:val="en-US"/>
-              </w:rPr>
-              <w:t>cambie</w:t>
-            </w:r>
-            <w:proofErr w:type="spellEnd"/>
-            <w:r>
-              <w:rPr>
-                <w:rFonts w:ascii="Times New Roman" w:eastAsia="Times New Roman" w:hAnsi="Times New Roman" w:cs="Times New Roman"/>
-                <w:lang w:val="en-US"/>
-              </w:rPr>
-              <w:t xml:space="preserve"> </w:t>
-            </w:r>
-            <w:proofErr w:type="spellStart"/>
-            <w:r>
-              <w:rPr>
-                <w:rFonts w:ascii="Times New Roman" w:eastAsia="Times New Roman" w:hAnsi="Times New Roman" w:cs="Times New Roman"/>
-                <w:lang w:val="en-US"/>
-              </w:rPr>
-              <w:t>estado</w:t>
-            </w:r>
-            <w:proofErr w:type="spellEnd"/>
-            <w:r>
-              <w:rPr>
-                <w:rFonts w:ascii="Times New Roman" w:eastAsia="Times New Roman" w:hAnsi="Times New Roman" w:cs="Times New Roman"/>
-                <w:lang w:val="en-US"/>
-              </w:rPr>
-              <w:t xml:space="preserve"> a COMPLETED.</w:t>
+              <w:t>Endpoint POST /bookings/validate que cambie estado a COMPLETED.</w:t>
             </w:r>
           </w:p>
         </w:tc>
@@ -18188,27 +16702,7 @@
                 <w:bCs w:val="0"/>
                 <w:lang w:val="es-EC"/>
               </w:rPr>
-              <w:t xml:space="preserve"> Sistema (</w:t>
-            </w:r>
-            <w:proofErr w:type="spellStart"/>
-            <w:r>
-              <w:rPr>
-                <w:rFonts w:ascii="Times New Roman" w:eastAsia="Times New Roman" w:hAnsi="Times New Roman" w:cs="Times New Roman"/>
-                <w:b w:val="0"/>
-                <w:bCs w:val="0"/>
-                <w:lang w:val="es-EC"/>
-              </w:rPr>
-              <w:t>Backend</w:t>
-            </w:r>
-            <w:proofErr w:type="spellEnd"/>
-            <w:r>
-              <w:rPr>
-                <w:rFonts w:ascii="Times New Roman" w:eastAsia="Times New Roman" w:hAnsi="Times New Roman" w:cs="Times New Roman"/>
-                <w:b w:val="0"/>
-                <w:bCs w:val="0"/>
-                <w:lang w:val="es-EC"/>
-              </w:rPr>
-              <w:t>)</w:t>
+              <w:t xml:space="preserve"> Sistema (Backend)</w:t>
             </w:r>
           </w:p>
         </w:tc>
@@ -18453,27 +16947,7 @@
                 <w:bCs w:val="0"/>
                 <w:lang w:val="es-EC"/>
               </w:rPr>
-              <w:t xml:space="preserve"> Como </w:t>
-            </w:r>
-            <w:proofErr w:type="spellStart"/>
-            <w:r>
-              <w:rPr>
-                <w:rFonts w:ascii="Times New Roman" w:eastAsia="Times New Roman" w:hAnsi="Times New Roman" w:cs="Times New Roman"/>
-                <w:b w:val="0"/>
-                <w:bCs w:val="0"/>
-                <w:lang w:val="es-EC"/>
-              </w:rPr>
-              <w:t>Product</w:t>
-            </w:r>
-            <w:proofErr w:type="spellEnd"/>
-            <w:r>
-              <w:rPr>
-                <w:rFonts w:ascii="Times New Roman" w:eastAsia="Times New Roman" w:hAnsi="Times New Roman" w:cs="Times New Roman"/>
-                <w:b w:val="0"/>
-                <w:bCs w:val="0"/>
-                <w:lang w:val="es-EC"/>
-              </w:rPr>
-              <w:t xml:space="preserve"> Owner, quiero que el sistema aumente el precio un 20% automáticamente si quedan menos de 48 horas o si la ocupación supera el 80%, para maximizar ingresos.</w:t>
+              <w:t xml:space="preserve"> Como Product Owner, quiero que el sistema aumente el precio un 20% automáticamente si quedan menos de 48 horas o si la ocupación supera el 80%, para maximizar ingresos.</w:t>
             </w:r>
           </w:p>
         </w:tc>
@@ -18772,23 +17246,7 @@
                 <w:rFonts w:ascii="Times New Roman" w:eastAsia="Times New Roman" w:hAnsi="Times New Roman" w:cs="Times New Roman"/>
                 <w:lang w:val="es-EC"/>
               </w:rPr>
-              <w:t xml:space="preserve">Verificar que el precio mostrado en el Home coincide con el precio en el </w:t>
-            </w:r>
-            <w:proofErr w:type="spellStart"/>
-            <w:r>
-              <w:rPr>
-                <w:rFonts w:ascii="Times New Roman" w:eastAsia="Times New Roman" w:hAnsi="Times New Roman" w:cs="Times New Roman"/>
-                <w:lang w:val="es-EC"/>
-              </w:rPr>
-              <w:t>Checkout</w:t>
-            </w:r>
-            <w:proofErr w:type="spellEnd"/>
-            <w:r>
-              <w:rPr>
-                <w:rFonts w:ascii="Times New Roman" w:eastAsia="Times New Roman" w:hAnsi="Times New Roman" w:cs="Times New Roman"/>
-                <w:lang w:val="es-EC"/>
-              </w:rPr>
-              <w:t>.</w:t>
+              <w:t>Verificar que el precio mostrado en el Home coincide con el precio en el Checkout.</w:t>
             </w:r>
           </w:p>
         </w:tc>
@@ -18830,17 +17288,8 @@
                 <w:rFonts w:ascii="Times New Roman" w:eastAsia="Times New Roman" w:hAnsi="Times New Roman" w:cs="Times New Roman"/>
                 <w:lang w:val="es-EC"/>
               </w:rPr>
-              <w:t xml:space="preserve">Jose Francisco Quezada </w:t>
-            </w:r>
-            <w:proofErr w:type="spellStart"/>
-            <w:r>
-              <w:rPr>
-                <w:rFonts w:ascii="Times New Roman" w:eastAsia="Times New Roman" w:hAnsi="Times New Roman" w:cs="Times New Roman"/>
-                <w:lang w:val="es-EC"/>
-              </w:rPr>
-              <w:t>Quezada</w:t>
-            </w:r>
-            <w:proofErr w:type="spellEnd"/>
+              <w:t>Jose Francisco Quezada Quezada</w:t>
+            </w:r>
           </w:p>
         </w:tc>
       </w:tr>
@@ -18992,55 +17441,7 @@
                 <w:rFonts w:ascii="Times New Roman" w:eastAsia="Times New Roman" w:hAnsi="Times New Roman" w:cs="Times New Roman"/>
                 <w:lang w:val="es-EC"/>
               </w:rPr>
-              <w:t xml:space="preserve">Crear servicio </w:t>
-            </w:r>
-            <w:proofErr w:type="spellStart"/>
-            <w:r>
-              <w:rPr>
-                <w:rFonts w:ascii="Times New Roman" w:eastAsia="Times New Roman" w:hAnsi="Times New Roman" w:cs="Times New Roman"/>
-                <w:lang w:val="es-EC"/>
-              </w:rPr>
-              <w:t>PricingService</w:t>
-            </w:r>
-            <w:proofErr w:type="spellEnd"/>
-            <w:r>
-              <w:rPr>
-                <w:rFonts w:ascii="Times New Roman" w:eastAsia="Times New Roman" w:hAnsi="Times New Roman" w:cs="Times New Roman"/>
-                <w:lang w:val="es-EC"/>
-              </w:rPr>
-              <w:t xml:space="preserve"> con lógica condicional (</w:t>
-            </w:r>
-            <w:proofErr w:type="spellStart"/>
-            <w:r>
-              <w:rPr>
-                <w:rFonts w:ascii="Times New Roman" w:eastAsia="Times New Roman" w:hAnsi="Times New Roman" w:cs="Times New Roman"/>
-                <w:lang w:val="es-EC"/>
-              </w:rPr>
-              <w:t>if</w:t>
-            </w:r>
-            <w:proofErr w:type="spellEnd"/>
-            <w:r>
-              <w:rPr>
-                <w:rFonts w:ascii="Times New Roman" w:eastAsia="Times New Roman" w:hAnsi="Times New Roman" w:cs="Times New Roman"/>
-                <w:lang w:val="es-EC"/>
-              </w:rPr>
-              <w:t>/</w:t>
-            </w:r>
-            <w:proofErr w:type="spellStart"/>
-            <w:r>
-              <w:rPr>
-                <w:rFonts w:ascii="Times New Roman" w:eastAsia="Times New Roman" w:hAnsi="Times New Roman" w:cs="Times New Roman"/>
-                <w:lang w:val="es-EC"/>
-              </w:rPr>
-              <w:t>else</w:t>
-            </w:r>
-            <w:proofErr w:type="spellEnd"/>
-            <w:r>
-              <w:rPr>
-                <w:rFonts w:ascii="Times New Roman" w:eastAsia="Times New Roman" w:hAnsi="Times New Roman" w:cs="Times New Roman"/>
-                <w:lang w:val="es-EC"/>
-              </w:rPr>
-              <w:t xml:space="preserve"> rules).</w:t>
+              <w:t>Crear servicio PricingService con lógica condicional (if/else rules).</w:t>
             </w:r>
           </w:p>
         </w:tc>
@@ -19096,23 +17497,7 @@
                 <w:rFonts w:ascii="Times New Roman" w:eastAsia="Times New Roman" w:hAnsi="Times New Roman" w:cs="Times New Roman"/>
                 <w:lang w:val="es-EC"/>
               </w:rPr>
-              <w:t xml:space="preserve">Refactorizar el </w:t>
-            </w:r>
-            <w:proofErr w:type="spellStart"/>
-            <w:r>
-              <w:rPr>
-                <w:rFonts w:ascii="Times New Roman" w:eastAsia="Times New Roman" w:hAnsi="Times New Roman" w:cs="Times New Roman"/>
-                <w:lang w:val="es-EC"/>
-              </w:rPr>
-              <w:t>endpoint</w:t>
-            </w:r>
-            <w:proofErr w:type="spellEnd"/>
-            <w:r>
-              <w:rPr>
-                <w:rFonts w:ascii="Times New Roman" w:eastAsia="Times New Roman" w:hAnsi="Times New Roman" w:cs="Times New Roman"/>
-                <w:lang w:val="es-EC"/>
-              </w:rPr>
-              <w:t xml:space="preserve"> de listado de tours para inyectar el precio calculado.</w:t>
+              <w:t>Refactorizar el endpoint de listado de tours para inyectar el precio calculado.</w:t>
             </w:r>
           </w:p>
         </w:tc>
@@ -19356,23 +17741,7 @@
                 <w:rFonts w:ascii="Times New Roman" w:eastAsia="Times New Roman" w:hAnsi="Times New Roman" w:cs="Times New Roman"/>
                 <w:lang w:val="es-EC"/>
               </w:rPr>
-              <w:t xml:space="preserve">Jose Francisco Quezada </w:t>
-            </w:r>
-            <w:proofErr w:type="spellStart"/>
-            <w:r>
-              <w:rPr>
-                <w:rFonts w:ascii="Times New Roman" w:eastAsia="Times New Roman" w:hAnsi="Times New Roman" w:cs="Times New Roman"/>
-                <w:lang w:val="es-EC"/>
-              </w:rPr>
-              <w:t>Quezada</w:t>
-            </w:r>
-            <w:proofErr w:type="spellEnd"/>
-            <w:r>
-              <w:rPr>
-                <w:rFonts w:ascii="Times New Roman" w:eastAsia="Times New Roman" w:hAnsi="Times New Roman" w:cs="Times New Roman"/>
-                <w:lang w:val="es-EC"/>
-              </w:rPr>
-              <w:t>, Cristhofer Steve Parreño Poma</w:t>
+              <w:t>Jose Francisco Quezada Quezada, Cristhofer Steve Parreño Poma</w:t>
             </w:r>
           </w:p>
           <w:p>
@@ -19516,23 +17885,7 @@
                 <w:rFonts w:ascii="Times New Roman" w:eastAsia="Times New Roman" w:hAnsi="Times New Roman" w:cs="Times New Roman"/>
                 <w:lang w:val="es-EC"/>
               </w:rPr>
-              <w:t xml:space="preserve">Jose Francisco Quezada </w:t>
-            </w:r>
-            <w:proofErr w:type="spellStart"/>
-            <w:r>
-              <w:rPr>
-                <w:rFonts w:ascii="Times New Roman" w:eastAsia="Times New Roman" w:hAnsi="Times New Roman" w:cs="Times New Roman"/>
-                <w:lang w:val="es-EC"/>
-              </w:rPr>
-              <w:t>Quezada</w:t>
-            </w:r>
-            <w:proofErr w:type="spellEnd"/>
-            <w:r>
-              <w:rPr>
-                <w:rFonts w:ascii="Times New Roman" w:eastAsia="Times New Roman" w:hAnsi="Times New Roman" w:cs="Times New Roman"/>
-                <w:lang w:val="es-EC"/>
-              </w:rPr>
-              <w:t>, Cristhofer Steve Parreño Poma</w:t>
+              <w:t>Jose Francisco Quezada Quezada, Cristhofer Steve Parreño Poma</w:t>
             </w:r>
           </w:p>
           <w:p>
@@ -19659,23 +18012,7 @@
                 <w:rFonts w:ascii="Times New Roman" w:eastAsia="Times New Roman" w:hAnsi="Times New Roman" w:cs="Times New Roman"/>
                 <w:lang w:val="es-EC"/>
               </w:rPr>
-              <w:t xml:space="preserve">Jose Francisco Quezada </w:t>
-            </w:r>
-            <w:proofErr w:type="spellStart"/>
-            <w:r>
-              <w:rPr>
-                <w:rFonts w:ascii="Times New Roman" w:eastAsia="Times New Roman" w:hAnsi="Times New Roman" w:cs="Times New Roman"/>
-                <w:lang w:val="es-EC"/>
-              </w:rPr>
-              <w:t>Quezada</w:t>
-            </w:r>
-            <w:proofErr w:type="spellEnd"/>
-            <w:r>
-              <w:rPr>
-                <w:rFonts w:ascii="Times New Roman" w:eastAsia="Times New Roman" w:hAnsi="Times New Roman" w:cs="Times New Roman"/>
-                <w:lang w:val="es-EC"/>
-              </w:rPr>
-              <w:t>, Cristhofer Steve Parreño Poma</w:t>
+              <w:t>Jose Francisco Quezada Quezada, Cristhofer Steve Parreño Poma</w:t>
             </w:r>
           </w:p>
           <w:p>
@@ -19802,23 +18139,7 @@
                 <w:rFonts w:ascii="Times New Roman" w:eastAsia="Times New Roman" w:hAnsi="Times New Roman" w:cs="Times New Roman"/>
                 <w:lang w:val="es-EC"/>
               </w:rPr>
-              <w:t xml:space="preserve">Jose Francisco Quezada </w:t>
-            </w:r>
-            <w:proofErr w:type="spellStart"/>
-            <w:r>
-              <w:rPr>
-                <w:rFonts w:ascii="Times New Roman" w:eastAsia="Times New Roman" w:hAnsi="Times New Roman" w:cs="Times New Roman"/>
-                <w:lang w:val="es-EC"/>
-              </w:rPr>
-              <w:t>Quezada</w:t>
-            </w:r>
-            <w:proofErr w:type="spellEnd"/>
-            <w:r>
-              <w:rPr>
-                <w:rFonts w:ascii="Times New Roman" w:eastAsia="Times New Roman" w:hAnsi="Times New Roman" w:cs="Times New Roman"/>
-                <w:lang w:val="es-EC"/>
-              </w:rPr>
-              <w:t>, Cristhofer Steve Parreño Poma</w:t>
+              <w:t>Jose Francisco Quezada Quezada, Cristhofer Steve Parreño Poma</w:t>
             </w:r>
           </w:p>
           <w:p>
@@ -19945,23 +18266,7 @@
                 <w:rFonts w:ascii="Times New Roman" w:eastAsia="Times New Roman" w:hAnsi="Times New Roman" w:cs="Times New Roman"/>
                 <w:lang w:val="es-EC"/>
               </w:rPr>
-              <w:t xml:space="preserve">Jose Francisco Quezada </w:t>
-            </w:r>
-            <w:proofErr w:type="spellStart"/>
-            <w:r>
-              <w:rPr>
-                <w:rFonts w:ascii="Times New Roman" w:eastAsia="Times New Roman" w:hAnsi="Times New Roman" w:cs="Times New Roman"/>
-                <w:lang w:val="es-EC"/>
-              </w:rPr>
-              <w:t>Quezada</w:t>
-            </w:r>
-            <w:proofErr w:type="spellEnd"/>
-            <w:r>
-              <w:rPr>
-                <w:rFonts w:ascii="Times New Roman" w:eastAsia="Times New Roman" w:hAnsi="Times New Roman" w:cs="Times New Roman"/>
-                <w:lang w:val="es-EC"/>
-              </w:rPr>
-              <w:t>, Cristhofer Steve Parreño Poma</w:t>
+              <w:t>Jose Francisco Quezada Quezada, Cristhofer Steve Parreño Poma</w:t>
             </w:r>
           </w:p>
           <w:p>
@@ -20088,23 +18393,7 @@
                 <w:rFonts w:ascii="Times New Roman" w:eastAsia="Times New Roman" w:hAnsi="Times New Roman" w:cs="Times New Roman"/>
                 <w:lang w:val="es-EC"/>
               </w:rPr>
-              <w:t xml:space="preserve">Jose Francisco Quezada </w:t>
-            </w:r>
-            <w:proofErr w:type="spellStart"/>
-            <w:r>
-              <w:rPr>
-                <w:rFonts w:ascii="Times New Roman" w:eastAsia="Times New Roman" w:hAnsi="Times New Roman" w:cs="Times New Roman"/>
-                <w:lang w:val="es-EC"/>
-              </w:rPr>
-              <w:t>Quezada</w:t>
-            </w:r>
-            <w:proofErr w:type="spellEnd"/>
-            <w:r>
-              <w:rPr>
-                <w:rFonts w:ascii="Times New Roman" w:eastAsia="Times New Roman" w:hAnsi="Times New Roman" w:cs="Times New Roman"/>
-                <w:lang w:val="es-EC"/>
-              </w:rPr>
-              <w:t>, Cristhofer Steve Parreño Poma</w:t>
+              <w:t>Jose Francisco Quezada Quezada, Cristhofer Steve Parreño Poma</w:t>
             </w:r>
           </w:p>
           <w:p>
@@ -20231,23 +18520,7 @@
                 <w:rFonts w:ascii="Times New Roman" w:eastAsia="Times New Roman" w:hAnsi="Times New Roman" w:cs="Times New Roman"/>
                 <w:lang w:val="es-EC"/>
               </w:rPr>
-              <w:t xml:space="preserve">Jose Francisco Quezada </w:t>
-            </w:r>
-            <w:proofErr w:type="spellStart"/>
-            <w:r>
-              <w:rPr>
-                <w:rFonts w:ascii="Times New Roman" w:eastAsia="Times New Roman" w:hAnsi="Times New Roman" w:cs="Times New Roman"/>
-                <w:lang w:val="es-EC"/>
-              </w:rPr>
-              <w:t>Quezada</w:t>
-            </w:r>
-            <w:proofErr w:type="spellEnd"/>
-            <w:r>
-              <w:rPr>
-                <w:rFonts w:ascii="Times New Roman" w:eastAsia="Times New Roman" w:hAnsi="Times New Roman" w:cs="Times New Roman"/>
-                <w:lang w:val="es-EC"/>
-              </w:rPr>
-              <w:t>, Cristhofer Steve Parreño Poma</w:t>
+              <w:t>Jose Francisco Quezada Quezada, Cristhofer Steve Parreño Poma</w:t>
             </w:r>
           </w:p>
           <w:p>
@@ -20381,17 +18654,8 @@
                 <w:rFonts w:ascii="Times New Roman" w:eastAsia="Times New Roman" w:hAnsi="Times New Roman" w:cs="Times New Roman"/>
                 <w:lang w:val="es-EC"/>
               </w:rPr>
-              <w:t xml:space="preserve">Jose Francisco Quezada </w:t>
-            </w:r>
-            <w:proofErr w:type="spellStart"/>
-            <w:r>
-              <w:rPr>
-                <w:rFonts w:ascii="Times New Roman" w:eastAsia="Times New Roman" w:hAnsi="Times New Roman" w:cs="Times New Roman"/>
-                <w:lang w:val="es-EC"/>
-              </w:rPr>
-              <w:t>Quezada</w:t>
-            </w:r>
-            <w:proofErr w:type="spellEnd"/>
+              <w:t>Jose Francisco Quezada Quezada</w:t>
+            </w:r>
           </w:p>
           <w:p>
             <w:pPr>
@@ -20543,23 +18807,7 @@
                 <w:rFonts w:ascii="Times New Roman" w:eastAsia="Times New Roman" w:hAnsi="Times New Roman" w:cs="Times New Roman"/>
                 <w:lang w:val="es-EC"/>
               </w:rPr>
-              <w:t xml:space="preserve">Jose Francisco Quezada </w:t>
-            </w:r>
-            <w:proofErr w:type="spellStart"/>
-            <w:r>
-              <w:rPr>
-                <w:rFonts w:ascii="Times New Roman" w:eastAsia="Times New Roman" w:hAnsi="Times New Roman" w:cs="Times New Roman"/>
-                <w:lang w:val="es-EC"/>
-              </w:rPr>
-              <w:t>Quezada</w:t>
-            </w:r>
-            <w:proofErr w:type="spellEnd"/>
-            <w:r>
-              <w:rPr>
-                <w:rFonts w:ascii="Times New Roman" w:eastAsia="Times New Roman" w:hAnsi="Times New Roman" w:cs="Times New Roman"/>
-                <w:lang w:val="es-EC"/>
-              </w:rPr>
-              <w:t>, Cristhofer Steve Parreño Poma</w:t>
+              <w:t>Jose Francisco Quezada Quezada, Cristhofer Steve Parreño Poma</w:t>
             </w:r>
           </w:p>
           <w:p>
@@ -20648,14 +18896,12 @@
         </w:rPr>
         <w:t xml:space="preserve">Tabla | </w:t>
       </w:r>
-      <w:proofErr w:type="spellStart"/>
       <w:r>
         <w:rPr>
           <w:rFonts w:ascii="Times New Roman" w:eastAsia="Times New Roman" w:hAnsi="Times New Roman" w:cs="Times New Roman"/>
         </w:rPr>
         <w:t>Sprints</w:t>
       </w:r>
-      <w:proofErr w:type="spellEnd"/>
     </w:p>
     <w:tbl>
       <w:tblPr>

</xml_diff>